<commit_message>
update with model predictions
</commit_message>
<xml_diff>
--- a/4. Models/outputs/model_coefficients.docx
+++ b/4. Models/outputs/model_coefficients.docx
@@ -511,7 +511,7 @@
                 <w:szCs w:val="22"/>
                 <w:color w:val="000000"/>
               </w:rPr>
-              <w:t xml:space="preserve">-2.32 ± 0.12, P &lt; 0.001</w:t>
+              <w:t xml:space="preserve">-2.95 ± 0.11, P &lt; 0.001</w:t>
             </w:r>
           </w:p>
         </w:tc>
@@ -565,7 +565,7 @@
                 <w:szCs w:val="22"/>
                 <w:color w:val="000000"/>
               </w:rPr>
-              <w:t xml:space="preserve">-2.32 ± 0.11, P &lt; 0.001</w:t>
+              <w:t xml:space="preserve">-2.94 ± 0.11, P &lt; 0.001</w:t>
             </w:r>
           </w:p>
         </w:tc>
@@ -619,7 +619,7 @@
                 <w:szCs w:val="22"/>
                 <w:color w:val="000000"/>
               </w:rPr>
-              <w:t xml:space="preserve">-2.39 ± 0.1, P &lt; 0.001</w:t>
+              <w:t xml:space="preserve">-2.69 ± 0.08, P &lt; 0.001</w:t>
             </w:r>
           </w:p>
         </w:tc>
@@ -673,7 +673,7 @@
                 <w:szCs w:val="22"/>
                 <w:color w:val="000000"/>
               </w:rPr>
-              <w:t xml:space="preserve">-2.36 ± 0.13, P &lt; 0.001</w:t>
+              <w:t xml:space="preserve">-2.66 ± 0.08, P &lt; 0.001</w:t>
             </w:r>
           </w:p>
         </w:tc>
@@ -727,7 +727,7 @@
                 <w:szCs w:val="22"/>
                 <w:color w:val="000000"/>
               </w:rPr>
-              <w:t xml:space="preserve">-3.67 ± 0.57, P &lt; 0.001</w:t>
+              <w:t xml:space="preserve">-4.69 ± 0.22, P &lt; 0.001</w:t>
             </w:r>
           </w:p>
         </w:tc>
@@ -781,7 +781,7 @@
                 <w:szCs w:val="22"/>
                 <w:color w:val="000000"/>
               </w:rPr>
-              <w:t xml:space="preserve">-3.61 ± 0.72, P &lt; 0.001</w:t>
+              <w:t xml:space="preserve">-4.64 ± 0.22, P &lt; 0.001</w:t>
             </w:r>
           </w:p>
         </w:tc>
@@ -895,277 +895,277 @@
                 <w:szCs w:val="22"/>
                 <w:color w:val="000000"/>
               </w:rPr>
-              <w:t xml:space="preserve">0.16 ± 0.04, P &lt; 0.001</w:t>
-            </w:r>
-          </w:p>
-        </w:tc>
-        <w:tc>
-          <w:tcPr>
-            <w:tcBorders>
-              <w:bottom w:val="none" w:sz="0" w:space="0" w:color="000000"/>
-              <w:top w:val="none" w:sz="0" w:space="0" w:color="000000"/>
-              <w:left w:val="none" w:sz="0" w:space="0" w:color="000000"/>
-              <w:right w:val="none" w:sz="0" w:space="0" w:color="000000"/>
-            </w:tcBorders>
-            <w:shd w:val="clear" w:color="auto" w:fill="FFFFFF"/>
-            <w:tcMar>
-              <w:top w:w="0" w:type="dxa"/>
-              <w:bottom w:w="0" w:type="dxa"/>
-              <w:left w:w="0" w:type="dxa"/>
-              <w:right w:w="0" w:type="dxa"/>
-            </w:tcMar>
-            <w:vAlign w:val="center"/>
-          </w:tcPr>
-          <w:p>
-            <w:pPr>
-              <w:jc w:val="left"/>
-              <w:pBdr>
-                <w:bottom w:val="none" w:sz="0" w:space="0" w:color="000000"/>
-                <w:top w:val="none" w:sz="0" w:space="0" w:color="000000"/>
-                <w:left w:val="none" w:sz="0" w:space="0" w:color="000000"/>
-                <w:right w:val="none" w:sz="0" w:space="0" w:color="000000"/>
-              </w:pBdr>
-              <w:spacing w:after="100" w:before="100" w:line="240"/>
-              <w:ind w:left="100" w:right="100" w:firstLine="0" w:firstLineChars="0"/>
-              <w:rPr>
-                <w:rFonts w:ascii="Arial" w:hAnsi="Arial" w:eastAsia="Arial" w:cs="Arial"/>
-                <w:i w:val="false"/>
-                <w:b w:val="false"/>
-                <w:u w:val="none"/>
-                <w:strike w:val="false"/>
-                <w:sz w:val="22"/>
-                <w:szCs w:val="22"/>
-                <w:color w:val="000000"/>
-              </w:rPr>
-            </w:pPr>
-            <w:r>
-              <w:rPr>
-                <w:rFonts w:ascii="Arial" w:hAnsi="Arial" w:eastAsia="Arial" w:cs="Arial"/>
-                <w:i w:val="false"/>
-                <w:b w:val="false"/>
-                <w:u w:val="none"/>
-                <w:strike w:val="false"/>
-                <w:sz w:val="22"/>
-                <w:szCs w:val="22"/>
-                <w:color w:val="000000"/>
-              </w:rPr>
-              <w:t xml:space="preserve">0.14 ± 0.03, P &lt; 0.001</w:t>
-            </w:r>
-          </w:p>
-        </w:tc>
-        <w:tc>
-          <w:tcPr>
-            <w:tcBorders>
-              <w:bottom w:val="none" w:sz="0" w:space="0" w:color="000000"/>
-              <w:top w:val="none" w:sz="0" w:space="0" w:color="000000"/>
-              <w:left w:val="none" w:sz="0" w:space="0" w:color="000000"/>
-              <w:right w:val="none" w:sz="0" w:space="0" w:color="000000"/>
-            </w:tcBorders>
-            <w:shd w:val="clear" w:color="auto" w:fill="FFFFFF"/>
-            <w:tcMar>
-              <w:top w:w="0" w:type="dxa"/>
-              <w:bottom w:w="0" w:type="dxa"/>
-              <w:left w:w="0" w:type="dxa"/>
-              <w:right w:w="0" w:type="dxa"/>
-            </w:tcMar>
-            <w:vAlign w:val="center"/>
-          </w:tcPr>
-          <w:p>
-            <w:pPr>
-              <w:jc w:val="left"/>
-              <w:pBdr>
-                <w:bottom w:val="none" w:sz="0" w:space="0" w:color="000000"/>
-                <w:top w:val="none" w:sz="0" w:space="0" w:color="000000"/>
-                <w:left w:val="none" w:sz="0" w:space="0" w:color="000000"/>
-                <w:right w:val="none" w:sz="0" w:space="0" w:color="000000"/>
-              </w:pBdr>
-              <w:spacing w:after="100" w:before="100" w:line="240"/>
-              <w:ind w:left="100" w:right="100" w:firstLine="0" w:firstLineChars="0"/>
-              <w:rPr>
-                <w:rFonts w:ascii="Arial" w:hAnsi="Arial" w:eastAsia="Arial" w:cs="Arial"/>
-                <w:i w:val="false"/>
-                <w:b w:val="false"/>
-                <w:u w:val="none"/>
-                <w:strike w:val="false"/>
-                <w:sz w:val="22"/>
-                <w:szCs w:val="22"/>
-                <w:color w:val="000000"/>
-              </w:rPr>
-            </w:pPr>
-            <w:r>
-              <w:rPr>
-                <w:rFonts w:ascii="Arial" w:hAnsi="Arial" w:eastAsia="Arial" w:cs="Arial"/>
-                <w:i w:val="false"/>
-                <w:b w:val="false"/>
-                <w:u w:val="none"/>
-                <w:strike w:val="false"/>
-                <w:sz w:val="22"/>
-                <w:szCs w:val="22"/>
-                <w:color w:val="000000"/>
-              </w:rPr>
-              <w:t xml:space="preserve">0.22 ± 0.03, P &lt; 0.001</w:t>
-            </w:r>
-          </w:p>
-        </w:tc>
-        <w:tc>
-          <w:tcPr>
-            <w:tcBorders>
-              <w:bottom w:val="none" w:sz="0" w:space="0" w:color="000000"/>
-              <w:top w:val="none" w:sz="0" w:space="0" w:color="000000"/>
-              <w:left w:val="none" w:sz="0" w:space="0" w:color="000000"/>
-              <w:right w:val="none" w:sz="0" w:space="0" w:color="000000"/>
-            </w:tcBorders>
-            <w:shd w:val="clear" w:color="auto" w:fill="FFFFFF"/>
-            <w:tcMar>
-              <w:top w:w="0" w:type="dxa"/>
-              <w:bottom w:w="0" w:type="dxa"/>
-              <w:left w:w="0" w:type="dxa"/>
-              <w:right w:w="0" w:type="dxa"/>
-            </w:tcMar>
-            <w:vAlign w:val="center"/>
-          </w:tcPr>
-          <w:p>
-            <w:pPr>
-              <w:jc w:val="left"/>
-              <w:pBdr>
-                <w:bottom w:val="none" w:sz="0" w:space="0" w:color="000000"/>
-                <w:top w:val="none" w:sz="0" w:space="0" w:color="000000"/>
-                <w:left w:val="none" w:sz="0" w:space="0" w:color="000000"/>
-                <w:right w:val="none" w:sz="0" w:space="0" w:color="000000"/>
-              </w:pBdr>
-              <w:spacing w:after="100" w:before="100" w:line="240"/>
-              <w:ind w:left="100" w:right="100" w:firstLine="0" w:firstLineChars="0"/>
-              <w:rPr>
-                <w:rFonts w:ascii="Arial" w:hAnsi="Arial" w:eastAsia="Arial" w:cs="Arial"/>
-                <w:i w:val="false"/>
-                <w:b w:val="false"/>
-                <w:u w:val="none"/>
-                <w:strike w:val="false"/>
-                <w:sz w:val="22"/>
-                <w:szCs w:val="22"/>
-                <w:color w:val="000000"/>
-              </w:rPr>
-            </w:pPr>
-            <w:r>
-              <w:rPr>
-                <w:rFonts w:ascii="Arial" w:hAnsi="Arial" w:eastAsia="Arial" w:cs="Arial"/>
-                <w:i w:val="false"/>
-                <w:b w:val="false"/>
-                <w:u w:val="none"/>
-                <w:strike w:val="false"/>
-                <w:sz w:val="22"/>
-                <w:szCs w:val="22"/>
-                <w:color w:val="000000"/>
-              </w:rPr>
-              <w:t xml:space="preserve">0.23 ± 0.03, P &lt; 0.001</w:t>
-            </w:r>
-          </w:p>
-        </w:tc>
-        <w:tc>
-          <w:tcPr>
-            <w:tcBorders>
-              <w:bottom w:val="none" w:sz="0" w:space="0" w:color="000000"/>
-              <w:top w:val="none" w:sz="0" w:space="0" w:color="000000"/>
-              <w:left w:val="none" w:sz="0" w:space="0" w:color="000000"/>
-              <w:right w:val="none" w:sz="0" w:space="0" w:color="000000"/>
-            </w:tcBorders>
-            <w:shd w:val="clear" w:color="auto" w:fill="FFFFFF"/>
-            <w:tcMar>
-              <w:top w:w="0" w:type="dxa"/>
-              <w:bottom w:w="0" w:type="dxa"/>
-              <w:left w:w="0" w:type="dxa"/>
-              <w:right w:w="0" w:type="dxa"/>
-            </w:tcMar>
-            <w:vAlign w:val="center"/>
-          </w:tcPr>
-          <w:p>
-            <w:pPr>
-              <w:jc w:val="left"/>
-              <w:pBdr>
-                <w:bottom w:val="none" w:sz="0" w:space="0" w:color="000000"/>
-                <w:top w:val="none" w:sz="0" w:space="0" w:color="000000"/>
-                <w:left w:val="none" w:sz="0" w:space="0" w:color="000000"/>
-                <w:right w:val="none" w:sz="0" w:space="0" w:color="000000"/>
-              </w:pBdr>
-              <w:spacing w:after="100" w:before="100" w:line="240"/>
-              <w:ind w:left="100" w:right="100" w:firstLine="0" w:firstLineChars="0"/>
-              <w:rPr>
-                <w:rFonts w:ascii="Arial" w:hAnsi="Arial" w:eastAsia="Arial" w:cs="Arial"/>
-                <w:i w:val="false"/>
-                <w:b w:val="false"/>
-                <w:u w:val="none"/>
-                <w:strike w:val="false"/>
-                <w:sz w:val="22"/>
-                <w:szCs w:val="22"/>
-                <w:color w:val="000000"/>
-              </w:rPr>
-            </w:pPr>
-            <w:r>
-              <w:rPr>
-                <w:rFonts w:ascii="Arial" w:hAnsi="Arial" w:eastAsia="Arial" w:cs="Arial"/>
-                <w:i w:val="false"/>
-                <w:b w:val="false"/>
-                <w:u w:val="none"/>
-                <w:strike w:val="false"/>
-                <w:sz w:val="22"/>
-                <w:szCs w:val="22"/>
-                <w:color w:val="000000"/>
-              </w:rPr>
-              <w:t xml:space="preserve">0.33 ± 0.05, P &lt; 0.001</w:t>
-            </w:r>
-          </w:p>
-        </w:tc>
-        <w:tc>
-          <w:tcPr>
-            <w:tcBorders>
-              <w:bottom w:val="none" w:sz="0" w:space="0" w:color="000000"/>
-              <w:top w:val="none" w:sz="0" w:space="0" w:color="000000"/>
-              <w:left w:val="none" w:sz="0" w:space="0" w:color="000000"/>
-              <w:right w:val="none" w:sz="0" w:space="0" w:color="000000"/>
-            </w:tcBorders>
-            <w:shd w:val="clear" w:color="auto" w:fill="FFFFFF"/>
-            <w:tcMar>
-              <w:top w:w="0" w:type="dxa"/>
-              <w:bottom w:w="0" w:type="dxa"/>
-              <w:left w:w="0" w:type="dxa"/>
-              <w:right w:w="0" w:type="dxa"/>
-            </w:tcMar>
-            <w:vAlign w:val="center"/>
-          </w:tcPr>
-          <w:p>
-            <w:pPr>
-              <w:jc w:val="left"/>
-              <w:pBdr>
-                <w:bottom w:val="none" w:sz="0" w:space="0" w:color="000000"/>
-                <w:top w:val="none" w:sz="0" w:space="0" w:color="000000"/>
-                <w:left w:val="none" w:sz="0" w:space="0" w:color="000000"/>
-                <w:right w:val="none" w:sz="0" w:space="0" w:color="000000"/>
-              </w:pBdr>
-              <w:spacing w:after="100" w:before="100" w:line="240"/>
-              <w:ind w:left="100" w:right="100" w:firstLine="0" w:firstLineChars="0"/>
-              <w:rPr>
-                <w:rFonts w:ascii="Arial" w:hAnsi="Arial" w:eastAsia="Arial" w:cs="Arial"/>
-                <w:i w:val="false"/>
-                <w:b w:val="false"/>
-                <w:u w:val="none"/>
-                <w:strike w:val="false"/>
-                <w:sz w:val="22"/>
-                <w:szCs w:val="22"/>
-                <w:color w:val="000000"/>
-              </w:rPr>
-            </w:pPr>
-            <w:r>
-              <w:rPr>
-                <w:rFonts w:ascii="Arial" w:hAnsi="Arial" w:eastAsia="Arial" w:cs="Arial"/>
-                <w:i w:val="false"/>
-                <w:b w:val="false"/>
-                <w:u w:val="none"/>
-                <w:strike w:val="false"/>
-                <w:sz w:val="22"/>
-                <w:szCs w:val="22"/>
-                <w:color w:val="000000"/>
-              </w:rPr>
-              <w:t xml:space="preserve">0.33 ± 0.05, P &lt; 0.001</w:t>
+              <w:t xml:space="preserve">0.17 ± 0.07, P &lt; 0.05</w:t>
+            </w:r>
+          </w:p>
+        </w:tc>
+        <w:tc>
+          <w:tcPr>
+            <w:tcBorders>
+              <w:bottom w:val="none" w:sz="0" w:space="0" w:color="000000"/>
+              <w:top w:val="none" w:sz="0" w:space="0" w:color="000000"/>
+              <w:left w:val="none" w:sz="0" w:space="0" w:color="000000"/>
+              <w:right w:val="none" w:sz="0" w:space="0" w:color="000000"/>
+            </w:tcBorders>
+            <w:shd w:val="clear" w:color="auto" w:fill="FFFFFF"/>
+            <w:tcMar>
+              <w:top w:w="0" w:type="dxa"/>
+              <w:bottom w:w="0" w:type="dxa"/>
+              <w:left w:w="0" w:type="dxa"/>
+              <w:right w:w="0" w:type="dxa"/>
+            </w:tcMar>
+            <w:vAlign w:val="center"/>
+          </w:tcPr>
+          <w:p>
+            <w:pPr>
+              <w:jc w:val="left"/>
+              <w:pBdr>
+                <w:bottom w:val="none" w:sz="0" w:space="0" w:color="000000"/>
+                <w:top w:val="none" w:sz="0" w:space="0" w:color="000000"/>
+                <w:left w:val="none" w:sz="0" w:space="0" w:color="000000"/>
+                <w:right w:val="none" w:sz="0" w:space="0" w:color="000000"/>
+              </w:pBdr>
+              <w:spacing w:after="100" w:before="100" w:line="240"/>
+              <w:ind w:left="100" w:right="100" w:firstLine="0" w:firstLineChars="0"/>
+              <w:rPr>
+                <w:rFonts w:ascii="Arial" w:hAnsi="Arial" w:eastAsia="Arial" w:cs="Arial"/>
+                <w:i w:val="false"/>
+                <w:b w:val="false"/>
+                <w:u w:val="none"/>
+                <w:strike w:val="false"/>
+                <w:sz w:val="22"/>
+                <w:szCs w:val="22"/>
+                <w:color w:val="000000"/>
+              </w:rPr>
+            </w:pPr>
+            <w:r>
+              <w:rPr>
+                <w:rFonts w:ascii="Arial" w:hAnsi="Arial" w:eastAsia="Arial" w:cs="Arial"/>
+                <w:i w:val="false"/>
+                <w:b w:val="false"/>
+                <w:u w:val="none"/>
+                <w:strike w:val="false"/>
+                <w:sz w:val="22"/>
+                <w:szCs w:val="22"/>
+                <w:color w:val="000000"/>
+              </w:rPr>
+              <w:t xml:space="preserve">0.17 ± 0.07, P &lt; 0.05</w:t>
+            </w:r>
+          </w:p>
+        </w:tc>
+        <w:tc>
+          <w:tcPr>
+            <w:tcBorders>
+              <w:bottom w:val="none" w:sz="0" w:space="0" w:color="000000"/>
+              <w:top w:val="none" w:sz="0" w:space="0" w:color="000000"/>
+              <w:left w:val="none" w:sz="0" w:space="0" w:color="000000"/>
+              <w:right w:val="none" w:sz="0" w:space="0" w:color="000000"/>
+            </w:tcBorders>
+            <w:shd w:val="clear" w:color="auto" w:fill="FFFFFF"/>
+            <w:tcMar>
+              <w:top w:w="0" w:type="dxa"/>
+              <w:bottom w:w="0" w:type="dxa"/>
+              <w:left w:w="0" w:type="dxa"/>
+              <w:right w:w="0" w:type="dxa"/>
+            </w:tcMar>
+            <w:vAlign w:val="center"/>
+          </w:tcPr>
+          <w:p>
+            <w:pPr>
+              <w:jc w:val="left"/>
+              <w:pBdr>
+                <w:bottom w:val="none" w:sz="0" w:space="0" w:color="000000"/>
+                <w:top w:val="none" w:sz="0" w:space="0" w:color="000000"/>
+                <w:left w:val="none" w:sz="0" w:space="0" w:color="000000"/>
+                <w:right w:val="none" w:sz="0" w:space="0" w:color="000000"/>
+              </w:pBdr>
+              <w:spacing w:after="100" w:before="100" w:line="240"/>
+              <w:ind w:left="100" w:right="100" w:firstLine="0" w:firstLineChars="0"/>
+              <w:rPr>
+                <w:rFonts w:ascii="Arial" w:hAnsi="Arial" w:eastAsia="Arial" w:cs="Arial"/>
+                <w:i w:val="false"/>
+                <w:b w:val="false"/>
+                <w:u w:val="none"/>
+                <w:strike w:val="false"/>
+                <w:sz w:val="22"/>
+                <w:szCs w:val="22"/>
+                <w:color w:val="000000"/>
+              </w:rPr>
+            </w:pPr>
+            <w:r>
+              <w:rPr>
+                <w:rFonts w:ascii="Arial" w:hAnsi="Arial" w:eastAsia="Arial" w:cs="Arial"/>
+                <w:i w:val="false"/>
+                <w:b w:val="false"/>
+                <w:u w:val="none"/>
+                <w:strike w:val="false"/>
+                <w:sz w:val="22"/>
+                <w:szCs w:val="22"/>
+                <w:color w:val="000000"/>
+              </w:rPr>
+              <w:t xml:space="preserve">0.22 ± 0.05, P &lt; 0.001</w:t>
+            </w:r>
+          </w:p>
+        </w:tc>
+        <w:tc>
+          <w:tcPr>
+            <w:tcBorders>
+              <w:bottom w:val="none" w:sz="0" w:space="0" w:color="000000"/>
+              <w:top w:val="none" w:sz="0" w:space="0" w:color="000000"/>
+              <w:left w:val="none" w:sz="0" w:space="0" w:color="000000"/>
+              <w:right w:val="none" w:sz="0" w:space="0" w:color="000000"/>
+            </w:tcBorders>
+            <w:shd w:val="clear" w:color="auto" w:fill="FFFFFF"/>
+            <w:tcMar>
+              <w:top w:w="0" w:type="dxa"/>
+              <w:bottom w:w="0" w:type="dxa"/>
+              <w:left w:w="0" w:type="dxa"/>
+              <w:right w:w="0" w:type="dxa"/>
+            </w:tcMar>
+            <w:vAlign w:val="center"/>
+          </w:tcPr>
+          <w:p>
+            <w:pPr>
+              <w:jc w:val="left"/>
+              <w:pBdr>
+                <w:bottom w:val="none" w:sz="0" w:space="0" w:color="000000"/>
+                <w:top w:val="none" w:sz="0" w:space="0" w:color="000000"/>
+                <w:left w:val="none" w:sz="0" w:space="0" w:color="000000"/>
+                <w:right w:val="none" w:sz="0" w:space="0" w:color="000000"/>
+              </w:pBdr>
+              <w:spacing w:after="100" w:before="100" w:line="240"/>
+              <w:ind w:left="100" w:right="100" w:firstLine="0" w:firstLineChars="0"/>
+              <w:rPr>
+                <w:rFonts w:ascii="Arial" w:hAnsi="Arial" w:eastAsia="Arial" w:cs="Arial"/>
+                <w:i w:val="false"/>
+                <w:b w:val="false"/>
+                <w:u w:val="none"/>
+                <w:strike w:val="false"/>
+                <w:sz w:val="22"/>
+                <w:szCs w:val="22"/>
+                <w:color w:val="000000"/>
+              </w:rPr>
+            </w:pPr>
+            <w:r>
+              <w:rPr>
+                <w:rFonts w:ascii="Arial" w:hAnsi="Arial" w:eastAsia="Arial" w:cs="Arial"/>
+                <w:i w:val="false"/>
+                <w:b w:val="false"/>
+                <w:u w:val="none"/>
+                <w:strike w:val="false"/>
+                <w:sz w:val="22"/>
+                <w:szCs w:val="22"/>
+                <w:color w:val="000000"/>
+              </w:rPr>
+              <w:t xml:space="preserve">0.25 ± 0.05, P &lt; 0.001</w:t>
+            </w:r>
+          </w:p>
+        </w:tc>
+        <w:tc>
+          <w:tcPr>
+            <w:tcBorders>
+              <w:bottom w:val="none" w:sz="0" w:space="0" w:color="000000"/>
+              <w:top w:val="none" w:sz="0" w:space="0" w:color="000000"/>
+              <w:left w:val="none" w:sz="0" w:space="0" w:color="000000"/>
+              <w:right w:val="none" w:sz="0" w:space="0" w:color="000000"/>
+            </w:tcBorders>
+            <w:shd w:val="clear" w:color="auto" w:fill="FFFFFF"/>
+            <w:tcMar>
+              <w:top w:w="0" w:type="dxa"/>
+              <w:bottom w:w="0" w:type="dxa"/>
+              <w:left w:w="0" w:type="dxa"/>
+              <w:right w:w="0" w:type="dxa"/>
+            </w:tcMar>
+            <w:vAlign w:val="center"/>
+          </w:tcPr>
+          <w:p>
+            <w:pPr>
+              <w:jc w:val="left"/>
+              <w:pBdr>
+                <w:bottom w:val="none" w:sz="0" w:space="0" w:color="000000"/>
+                <w:top w:val="none" w:sz="0" w:space="0" w:color="000000"/>
+                <w:left w:val="none" w:sz="0" w:space="0" w:color="000000"/>
+                <w:right w:val="none" w:sz="0" w:space="0" w:color="000000"/>
+              </w:pBdr>
+              <w:spacing w:after="100" w:before="100" w:line="240"/>
+              <w:ind w:left="100" w:right="100" w:firstLine="0" w:firstLineChars="0"/>
+              <w:rPr>
+                <w:rFonts w:ascii="Arial" w:hAnsi="Arial" w:eastAsia="Arial" w:cs="Arial"/>
+                <w:i w:val="false"/>
+                <w:b w:val="false"/>
+                <w:u w:val="none"/>
+                <w:strike w:val="false"/>
+                <w:sz w:val="22"/>
+                <w:szCs w:val="22"/>
+                <w:color w:val="000000"/>
+              </w:rPr>
+            </w:pPr>
+            <w:r>
+              <w:rPr>
+                <w:rFonts w:ascii="Arial" w:hAnsi="Arial" w:eastAsia="Arial" w:cs="Arial"/>
+                <w:i w:val="false"/>
+                <w:b w:val="false"/>
+                <w:u w:val="none"/>
+                <w:strike w:val="false"/>
+                <w:sz w:val="22"/>
+                <w:szCs w:val="22"/>
+                <w:color w:val="000000"/>
+              </w:rPr>
+              <w:t xml:space="preserve">0.21 ± 0.1, P &lt; 0.05</w:t>
+            </w:r>
+          </w:p>
+        </w:tc>
+        <w:tc>
+          <w:tcPr>
+            <w:tcBorders>
+              <w:bottom w:val="none" w:sz="0" w:space="0" w:color="000000"/>
+              <w:top w:val="none" w:sz="0" w:space="0" w:color="000000"/>
+              <w:left w:val="none" w:sz="0" w:space="0" w:color="000000"/>
+              <w:right w:val="none" w:sz="0" w:space="0" w:color="000000"/>
+            </w:tcBorders>
+            <w:shd w:val="clear" w:color="auto" w:fill="FFFFFF"/>
+            <w:tcMar>
+              <w:top w:w="0" w:type="dxa"/>
+              <w:bottom w:w="0" w:type="dxa"/>
+              <w:left w:w="0" w:type="dxa"/>
+              <w:right w:w="0" w:type="dxa"/>
+            </w:tcMar>
+            <w:vAlign w:val="center"/>
+          </w:tcPr>
+          <w:p>
+            <w:pPr>
+              <w:jc w:val="left"/>
+              <w:pBdr>
+                <w:bottom w:val="none" w:sz="0" w:space="0" w:color="000000"/>
+                <w:top w:val="none" w:sz="0" w:space="0" w:color="000000"/>
+                <w:left w:val="none" w:sz="0" w:space="0" w:color="000000"/>
+                <w:right w:val="none" w:sz="0" w:space="0" w:color="000000"/>
+              </w:pBdr>
+              <w:spacing w:after="100" w:before="100" w:line="240"/>
+              <w:ind w:left="100" w:right="100" w:firstLine="0" w:firstLineChars="0"/>
+              <w:rPr>
+                <w:rFonts w:ascii="Arial" w:hAnsi="Arial" w:eastAsia="Arial" w:cs="Arial"/>
+                <w:i w:val="false"/>
+                <w:b w:val="false"/>
+                <w:u w:val="none"/>
+                <w:strike w:val="false"/>
+                <w:sz w:val="22"/>
+                <w:szCs w:val="22"/>
+                <w:color w:val="000000"/>
+              </w:rPr>
+            </w:pPr>
+            <w:r>
+              <w:rPr>
+                <w:rFonts w:ascii="Arial" w:hAnsi="Arial" w:eastAsia="Arial" w:cs="Arial"/>
+                <w:i w:val="false"/>
+                <w:b w:val="false"/>
+                <w:u w:val="none"/>
+                <w:strike w:val="false"/>
+                <w:sz w:val="22"/>
+                <w:szCs w:val="22"/>
+                <w:color w:val="000000"/>
+              </w:rPr>
+              <w:t xml:space="preserve">0.24 ± 0.1, P &lt; 0.05</w:t>
             </w:r>
           </w:p>
         </w:tc>
@@ -1279,277 +1279,277 @@
                 <w:szCs w:val="22"/>
                 <w:color w:val="000000"/>
               </w:rPr>
-              <w:t xml:space="preserve">-0.07 ± 0.04, P = 0.121</w:t>
-            </w:r>
-          </w:p>
-        </w:tc>
-        <w:tc>
-          <w:tcPr>
-            <w:tcBorders>
-              <w:bottom w:val="none" w:sz="0" w:space="0" w:color="000000"/>
-              <w:top w:val="none" w:sz="0" w:space="0" w:color="000000"/>
-              <w:left w:val="none" w:sz="0" w:space="0" w:color="000000"/>
-              <w:right w:val="none" w:sz="0" w:space="0" w:color="000000"/>
-            </w:tcBorders>
-            <w:shd w:val="clear" w:color="auto" w:fill="FFFFFF"/>
-            <w:tcMar>
-              <w:top w:w="0" w:type="dxa"/>
-              <w:bottom w:w="0" w:type="dxa"/>
-              <w:left w:w="0" w:type="dxa"/>
-              <w:right w:w="0" w:type="dxa"/>
-            </w:tcMar>
-            <w:vAlign w:val="center"/>
-          </w:tcPr>
-          <w:p>
-            <w:pPr>
-              <w:jc w:val="left"/>
-              <w:pBdr>
-                <w:bottom w:val="none" w:sz="0" w:space="0" w:color="000000"/>
-                <w:top w:val="none" w:sz="0" w:space="0" w:color="000000"/>
-                <w:left w:val="none" w:sz="0" w:space="0" w:color="000000"/>
-                <w:right w:val="none" w:sz="0" w:space="0" w:color="000000"/>
-              </w:pBdr>
-              <w:spacing w:after="100" w:before="100" w:line="240"/>
-              <w:ind w:left="100" w:right="100" w:firstLine="0" w:firstLineChars="0"/>
-              <w:rPr>
-                <w:rFonts w:ascii="Arial" w:hAnsi="Arial" w:eastAsia="Arial" w:cs="Arial"/>
-                <w:i w:val="false"/>
-                <w:b w:val="false"/>
-                <w:u w:val="none"/>
-                <w:strike w:val="false"/>
-                <w:sz w:val="22"/>
-                <w:szCs w:val="22"/>
-                <w:color w:val="000000"/>
-              </w:rPr>
-            </w:pPr>
-            <w:r>
-              <w:rPr>
-                <w:rFonts w:ascii="Arial" w:hAnsi="Arial" w:eastAsia="Arial" w:cs="Arial"/>
-                <w:i w:val="false"/>
-                <w:b w:val="false"/>
-                <w:u w:val="none"/>
-                <w:strike w:val="false"/>
-                <w:sz w:val="22"/>
-                <w:szCs w:val="22"/>
-                <w:color w:val="000000"/>
-              </w:rPr>
-              <w:t xml:space="preserve">-0.13 ± 0.04, P &lt; 0.01</w:t>
-            </w:r>
-          </w:p>
-        </w:tc>
-        <w:tc>
-          <w:tcPr>
-            <w:tcBorders>
-              <w:bottom w:val="none" w:sz="0" w:space="0" w:color="000000"/>
-              <w:top w:val="none" w:sz="0" w:space="0" w:color="000000"/>
-              <w:left w:val="none" w:sz="0" w:space="0" w:color="000000"/>
-              <w:right w:val="none" w:sz="0" w:space="0" w:color="000000"/>
-            </w:tcBorders>
-            <w:shd w:val="clear" w:color="auto" w:fill="FFFFFF"/>
-            <w:tcMar>
-              <w:top w:w="0" w:type="dxa"/>
-              <w:bottom w:w="0" w:type="dxa"/>
-              <w:left w:w="0" w:type="dxa"/>
-              <w:right w:w="0" w:type="dxa"/>
-            </w:tcMar>
-            <w:vAlign w:val="center"/>
-          </w:tcPr>
-          <w:p>
-            <w:pPr>
-              <w:jc w:val="left"/>
-              <w:pBdr>
-                <w:bottom w:val="none" w:sz="0" w:space="0" w:color="000000"/>
-                <w:top w:val="none" w:sz="0" w:space="0" w:color="000000"/>
-                <w:left w:val="none" w:sz="0" w:space="0" w:color="000000"/>
-                <w:right w:val="none" w:sz="0" w:space="0" w:color="000000"/>
-              </w:pBdr>
-              <w:spacing w:after="100" w:before="100" w:line="240"/>
-              <w:ind w:left="100" w:right="100" w:firstLine="0" w:firstLineChars="0"/>
-              <w:rPr>
-                <w:rFonts w:ascii="Arial" w:hAnsi="Arial" w:eastAsia="Arial" w:cs="Arial"/>
-                <w:i w:val="false"/>
-                <w:b w:val="false"/>
-                <w:u w:val="none"/>
-                <w:strike w:val="false"/>
-                <w:sz w:val="22"/>
-                <w:szCs w:val="22"/>
-                <w:color w:val="000000"/>
-              </w:rPr>
-            </w:pPr>
-            <w:r>
-              <w:rPr>
-                <w:rFonts w:ascii="Arial" w:hAnsi="Arial" w:eastAsia="Arial" w:cs="Arial"/>
-                <w:i w:val="false"/>
-                <w:b w:val="false"/>
-                <w:u w:val="none"/>
-                <w:strike w:val="false"/>
-                <w:sz w:val="22"/>
-                <w:szCs w:val="22"/>
-                <w:color w:val="000000"/>
-              </w:rPr>
-              <w:t xml:space="preserve">-0.21 ± 0.05, P &lt; 0.001</w:t>
-            </w:r>
-          </w:p>
-        </w:tc>
-        <w:tc>
-          <w:tcPr>
-            <w:tcBorders>
-              <w:bottom w:val="none" w:sz="0" w:space="0" w:color="000000"/>
-              <w:top w:val="none" w:sz="0" w:space="0" w:color="000000"/>
-              <w:left w:val="none" w:sz="0" w:space="0" w:color="000000"/>
-              <w:right w:val="none" w:sz="0" w:space="0" w:color="000000"/>
-            </w:tcBorders>
-            <w:shd w:val="clear" w:color="auto" w:fill="FFFFFF"/>
-            <w:tcMar>
-              <w:top w:w="0" w:type="dxa"/>
-              <w:bottom w:w="0" w:type="dxa"/>
-              <w:left w:w="0" w:type="dxa"/>
-              <w:right w:w="0" w:type="dxa"/>
-            </w:tcMar>
-            <w:vAlign w:val="center"/>
-          </w:tcPr>
-          <w:p>
-            <w:pPr>
-              <w:jc w:val="left"/>
-              <w:pBdr>
-                <w:bottom w:val="none" w:sz="0" w:space="0" w:color="000000"/>
-                <w:top w:val="none" w:sz="0" w:space="0" w:color="000000"/>
-                <w:left w:val="none" w:sz="0" w:space="0" w:color="000000"/>
-                <w:right w:val="none" w:sz="0" w:space="0" w:color="000000"/>
-              </w:pBdr>
-              <w:spacing w:after="100" w:before="100" w:line="240"/>
-              <w:ind w:left="100" w:right="100" w:firstLine="0" w:firstLineChars="0"/>
-              <w:rPr>
-                <w:rFonts w:ascii="Arial" w:hAnsi="Arial" w:eastAsia="Arial" w:cs="Arial"/>
-                <w:i w:val="false"/>
-                <w:b w:val="false"/>
-                <w:u w:val="none"/>
-                <w:strike w:val="false"/>
-                <w:sz w:val="22"/>
-                <w:szCs w:val="22"/>
-                <w:color w:val="000000"/>
-              </w:rPr>
-            </w:pPr>
-            <w:r>
-              <w:rPr>
-                <w:rFonts w:ascii="Arial" w:hAnsi="Arial" w:eastAsia="Arial" w:cs="Arial"/>
-                <w:i w:val="false"/>
-                <w:b w:val="false"/>
-                <w:u w:val="none"/>
-                <w:strike w:val="false"/>
-                <w:sz w:val="22"/>
-                <w:szCs w:val="22"/>
-                <w:color w:val="000000"/>
-              </w:rPr>
-              <w:t xml:space="preserve">-0.21 ± 0.05, P &lt; 0.001</w:t>
-            </w:r>
-          </w:p>
-        </w:tc>
-        <w:tc>
-          <w:tcPr>
-            <w:tcBorders>
-              <w:bottom w:val="none" w:sz="0" w:space="0" w:color="000000"/>
-              <w:top w:val="none" w:sz="0" w:space="0" w:color="000000"/>
-              <w:left w:val="none" w:sz="0" w:space="0" w:color="000000"/>
-              <w:right w:val="none" w:sz="0" w:space="0" w:color="000000"/>
-            </w:tcBorders>
-            <w:shd w:val="clear" w:color="auto" w:fill="FFFFFF"/>
-            <w:tcMar>
-              <w:top w:w="0" w:type="dxa"/>
-              <w:bottom w:w="0" w:type="dxa"/>
-              <w:left w:w="0" w:type="dxa"/>
-              <w:right w:w="0" w:type="dxa"/>
-            </w:tcMar>
-            <w:vAlign w:val="center"/>
-          </w:tcPr>
-          <w:p>
-            <w:pPr>
-              <w:jc w:val="left"/>
-              <w:pBdr>
-                <w:bottom w:val="none" w:sz="0" w:space="0" w:color="000000"/>
-                <w:top w:val="none" w:sz="0" w:space="0" w:color="000000"/>
-                <w:left w:val="none" w:sz="0" w:space="0" w:color="000000"/>
-                <w:right w:val="none" w:sz="0" w:space="0" w:color="000000"/>
-              </w:pBdr>
-              <w:spacing w:after="100" w:before="100" w:line="240"/>
-              <w:ind w:left="100" w:right="100" w:firstLine="0" w:firstLineChars="0"/>
-              <w:rPr>
-                <w:rFonts w:ascii="Arial" w:hAnsi="Arial" w:eastAsia="Arial" w:cs="Arial"/>
-                <w:i w:val="false"/>
-                <w:b w:val="false"/>
-                <w:u w:val="none"/>
-                <w:strike w:val="false"/>
-                <w:sz w:val="22"/>
-                <w:szCs w:val="22"/>
-                <w:color w:val="000000"/>
-              </w:rPr>
-            </w:pPr>
-            <w:r>
-              <w:rPr>
-                <w:rFonts w:ascii="Arial" w:hAnsi="Arial" w:eastAsia="Arial" w:cs="Arial"/>
-                <w:i w:val="false"/>
-                <w:b w:val="false"/>
-                <w:u w:val="none"/>
-                <w:strike w:val="false"/>
-                <w:sz w:val="22"/>
-                <w:szCs w:val="22"/>
-                <w:color w:val="000000"/>
-              </w:rPr>
-              <w:t xml:space="preserve">-0.29 ± 0.07, P &lt; 0.001</w:t>
-            </w:r>
-          </w:p>
-        </w:tc>
-        <w:tc>
-          <w:tcPr>
-            <w:tcBorders>
-              <w:bottom w:val="none" w:sz="0" w:space="0" w:color="000000"/>
-              <w:top w:val="none" w:sz="0" w:space="0" w:color="000000"/>
-              <w:left w:val="none" w:sz="0" w:space="0" w:color="000000"/>
-              <w:right w:val="none" w:sz="0" w:space="0" w:color="000000"/>
-            </w:tcBorders>
-            <w:shd w:val="clear" w:color="auto" w:fill="FFFFFF"/>
-            <w:tcMar>
-              <w:top w:w="0" w:type="dxa"/>
-              <w:bottom w:w="0" w:type="dxa"/>
-              <w:left w:w="0" w:type="dxa"/>
-              <w:right w:w="0" w:type="dxa"/>
-            </w:tcMar>
-            <w:vAlign w:val="center"/>
-          </w:tcPr>
-          <w:p>
-            <w:pPr>
-              <w:jc w:val="left"/>
-              <w:pBdr>
-                <w:bottom w:val="none" w:sz="0" w:space="0" w:color="000000"/>
-                <w:top w:val="none" w:sz="0" w:space="0" w:color="000000"/>
-                <w:left w:val="none" w:sz="0" w:space="0" w:color="000000"/>
-                <w:right w:val="none" w:sz="0" w:space="0" w:color="000000"/>
-              </w:pBdr>
-              <w:spacing w:after="100" w:before="100" w:line="240"/>
-              <w:ind w:left="100" w:right="100" w:firstLine="0" w:firstLineChars="0"/>
-              <w:rPr>
-                <w:rFonts w:ascii="Arial" w:hAnsi="Arial" w:eastAsia="Arial" w:cs="Arial"/>
-                <w:i w:val="false"/>
-                <w:b w:val="false"/>
-                <w:u w:val="none"/>
-                <w:strike w:val="false"/>
-                <w:sz w:val="22"/>
-                <w:szCs w:val="22"/>
-                <w:color w:val="000000"/>
-              </w:rPr>
-            </w:pPr>
-            <w:r>
-              <w:rPr>
-                <w:rFonts w:ascii="Arial" w:hAnsi="Arial" w:eastAsia="Arial" w:cs="Arial"/>
-                <w:i w:val="false"/>
-                <w:b w:val="false"/>
-                <w:u w:val="none"/>
-                <w:strike w:val="false"/>
-                <w:sz w:val="22"/>
-                <w:szCs w:val="22"/>
-                <w:color w:val="000000"/>
-              </w:rPr>
-              <w:t xml:space="preserve">-0.3 ± 0.06, P &lt; 0.001</w:t>
+              <w:t xml:space="preserve">-0.12 ± 0.08, P = 0.146</w:t>
+            </w:r>
+          </w:p>
+        </w:tc>
+        <w:tc>
+          <w:tcPr>
+            <w:tcBorders>
+              <w:bottom w:val="none" w:sz="0" w:space="0" w:color="000000"/>
+              <w:top w:val="none" w:sz="0" w:space="0" w:color="000000"/>
+              <w:left w:val="none" w:sz="0" w:space="0" w:color="000000"/>
+              <w:right w:val="none" w:sz="0" w:space="0" w:color="000000"/>
+            </w:tcBorders>
+            <w:shd w:val="clear" w:color="auto" w:fill="FFFFFF"/>
+            <w:tcMar>
+              <w:top w:w="0" w:type="dxa"/>
+              <w:bottom w:w="0" w:type="dxa"/>
+              <w:left w:w="0" w:type="dxa"/>
+              <w:right w:w="0" w:type="dxa"/>
+            </w:tcMar>
+            <w:vAlign w:val="center"/>
+          </w:tcPr>
+          <w:p>
+            <w:pPr>
+              <w:jc w:val="left"/>
+              <w:pBdr>
+                <w:bottom w:val="none" w:sz="0" w:space="0" w:color="000000"/>
+                <w:top w:val="none" w:sz="0" w:space="0" w:color="000000"/>
+                <w:left w:val="none" w:sz="0" w:space="0" w:color="000000"/>
+                <w:right w:val="none" w:sz="0" w:space="0" w:color="000000"/>
+              </w:pBdr>
+              <w:spacing w:after="100" w:before="100" w:line="240"/>
+              <w:ind w:left="100" w:right="100" w:firstLine="0" w:firstLineChars="0"/>
+              <w:rPr>
+                <w:rFonts w:ascii="Arial" w:hAnsi="Arial" w:eastAsia="Arial" w:cs="Arial"/>
+                <w:i w:val="false"/>
+                <w:b w:val="false"/>
+                <w:u w:val="none"/>
+                <w:strike w:val="false"/>
+                <w:sz w:val="22"/>
+                <w:szCs w:val="22"/>
+                <w:color w:val="000000"/>
+              </w:rPr>
+            </w:pPr>
+            <w:r>
+              <w:rPr>
+                <w:rFonts w:ascii="Arial" w:hAnsi="Arial" w:eastAsia="Arial" w:cs="Arial"/>
+                <w:i w:val="false"/>
+                <w:b w:val="false"/>
+                <w:u w:val="none"/>
+                <w:strike w:val="false"/>
+                <w:sz w:val="22"/>
+                <w:szCs w:val="22"/>
+                <w:color w:val="000000"/>
+              </w:rPr>
+              <w:t xml:space="preserve">-0.14 ± 0.08, P = 0.079</w:t>
+            </w:r>
+          </w:p>
+        </w:tc>
+        <w:tc>
+          <w:tcPr>
+            <w:tcBorders>
+              <w:bottom w:val="none" w:sz="0" w:space="0" w:color="000000"/>
+              <w:top w:val="none" w:sz="0" w:space="0" w:color="000000"/>
+              <w:left w:val="none" w:sz="0" w:space="0" w:color="000000"/>
+              <w:right w:val="none" w:sz="0" w:space="0" w:color="000000"/>
+            </w:tcBorders>
+            <w:shd w:val="clear" w:color="auto" w:fill="FFFFFF"/>
+            <w:tcMar>
+              <w:top w:w="0" w:type="dxa"/>
+              <w:bottom w:w="0" w:type="dxa"/>
+              <w:left w:w="0" w:type="dxa"/>
+              <w:right w:w="0" w:type="dxa"/>
+            </w:tcMar>
+            <w:vAlign w:val="center"/>
+          </w:tcPr>
+          <w:p>
+            <w:pPr>
+              <w:jc w:val="left"/>
+              <w:pBdr>
+                <w:bottom w:val="none" w:sz="0" w:space="0" w:color="000000"/>
+                <w:top w:val="none" w:sz="0" w:space="0" w:color="000000"/>
+                <w:left w:val="none" w:sz="0" w:space="0" w:color="000000"/>
+                <w:right w:val="none" w:sz="0" w:space="0" w:color="000000"/>
+              </w:pBdr>
+              <w:spacing w:after="100" w:before="100" w:line="240"/>
+              <w:ind w:left="100" w:right="100" w:firstLine="0" w:firstLineChars="0"/>
+              <w:rPr>
+                <w:rFonts w:ascii="Arial" w:hAnsi="Arial" w:eastAsia="Arial" w:cs="Arial"/>
+                <w:i w:val="false"/>
+                <w:b w:val="false"/>
+                <w:u w:val="none"/>
+                <w:strike w:val="false"/>
+                <w:sz w:val="22"/>
+                <w:szCs w:val="22"/>
+                <w:color w:val="000000"/>
+              </w:rPr>
+            </w:pPr>
+            <w:r>
+              <w:rPr>
+                <w:rFonts w:ascii="Arial" w:hAnsi="Arial" w:eastAsia="Arial" w:cs="Arial"/>
+                <w:i w:val="false"/>
+                <w:b w:val="false"/>
+                <w:u w:val="none"/>
+                <w:strike w:val="false"/>
+                <w:sz w:val="22"/>
+                <w:szCs w:val="22"/>
+                <w:color w:val="000000"/>
+              </w:rPr>
+              <w:t xml:space="preserve">-0.21 ± 0.06, P &lt; 0.01</w:t>
+            </w:r>
+          </w:p>
+        </w:tc>
+        <w:tc>
+          <w:tcPr>
+            <w:tcBorders>
+              <w:bottom w:val="none" w:sz="0" w:space="0" w:color="000000"/>
+              <w:top w:val="none" w:sz="0" w:space="0" w:color="000000"/>
+              <w:left w:val="none" w:sz="0" w:space="0" w:color="000000"/>
+              <w:right w:val="none" w:sz="0" w:space="0" w:color="000000"/>
+            </w:tcBorders>
+            <w:shd w:val="clear" w:color="auto" w:fill="FFFFFF"/>
+            <w:tcMar>
+              <w:top w:w="0" w:type="dxa"/>
+              <w:bottom w:w="0" w:type="dxa"/>
+              <w:left w:w="0" w:type="dxa"/>
+              <w:right w:w="0" w:type="dxa"/>
+            </w:tcMar>
+            <w:vAlign w:val="center"/>
+          </w:tcPr>
+          <w:p>
+            <w:pPr>
+              <w:jc w:val="left"/>
+              <w:pBdr>
+                <w:bottom w:val="none" w:sz="0" w:space="0" w:color="000000"/>
+                <w:top w:val="none" w:sz="0" w:space="0" w:color="000000"/>
+                <w:left w:val="none" w:sz="0" w:space="0" w:color="000000"/>
+                <w:right w:val="none" w:sz="0" w:space="0" w:color="000000"/>
+              </w:pBdr>
+              <w:spacing w:after="100" w:before="100" w:line="240"/>
+              <w:ind w:left="100" w:right="100" w:firstLine="0" w:firstLineChars="0"/>
+              <w:rPr>
+                <w:rFonts w:ascii="Arial" w:hAnsi="Arial" w:eastAsia="Arial" w:cs="Arial"/>
+                <w:i w:val="false"/>
+                <w:b w:val="false"/>
+                <w:u w:val="none"/>
+                <w:strike w:val="false"/>
+                <w:sz w:val="22"/>
+                <w:szCs w:val="22"/>
+                <w:color w:val="000000"/>
+              </w:rPr>
+            </w:pPr>
+            <w:r>
+              <w:rPr>
+                <w:rFonts w:ascii="Arial" w:hAnsi="Arial" w:eastAsia="Arial" w:cs="Arial"/>
+                <w:i w:val="false"/>
+                <w:b w:val="false"/>
+                <w:u w:val="none"/>
+                <w:strike w:val="false"/>
+                <w:sz w:val="22"/>
+                <w:szCs w:val="22"/>
+                <w:color w:val="000000"/>
+              </w:rPr>
+              <w:t xml:space="preserve">-0.2 ± 0.07, P &lt; 0.01</w:t>
+            </w:r>
+          </w:p>
+        </w:tc>
+        <w:tc>
+          <w:tcPr>
+            <w:tcBorders>
+              <w:bottom w:val="none" w:sz="0" w:space="0" w:color="000000"/>
+              <w:top w:val="none" w:sz="0" w:space="0" w:color="000000"/>
+              <w:left w:val="none" w:sz="0" w:space="0" w:color="000000"/>
+              <w:right w:val="none" w:sz="0" w:space="0" w:color="000000"/>
+            </w:tcBorders>
+            <w:shd w:val="clear" w:color="auto" w:fill="FFFFFF"/>
+            <w:tcMar>
+              <w:top w:w="0" w:type="dxa"/>
+              <w:bottom w:w="0" w:type="dxa"/>
+              <w:left w:w="0" w:type="dxa"/>
+              <w:right w:w="0" w:type="dxa"/>
+            </w:tcMar>
+            <w:vAlign w:val="center"/>
+          </w:tcPr>
+          <w:p>
+            <w:pPr>
+              <w:jc w:val="left"/>
+              <w:pBdr>
+                <w:bottom w:val="none" w:sz="0" w:space="0" w:color="000000"/>
+                <w:top w:val="none" w:sz="0" w:space="0" w:color="000000"/>
+                <w:left w:val="none" w:sz="0" w:space="0" w:color="000000"/>
+                <w:right w:val="none" w:sz="0" w:space="0" w:color="000000"/>
+              </w:pBdr>
+              <w:spacing w:after="100" w:before="100" w:line="240"/>
+              <w:ind w:left="100" w:right="100" w:firstLine="0" w:firstLineChars="0"/>
+              <w:rPr>
+                <w:rFonts w:ascii="Arial" w:hAnsi="Arial" w:eastAsia="Arial" w:cs="Arial"/>
+                <w:i w:val="false"/>
+                <w:b w:val="false"/>
+                <w:u w:val="none"/>
+                <w:strike w:val="false"/>
+                <w:sz w:val="22"/>
+                <w:szCs w:val="22"/>
+                <w:color w:val="000000"/>
+              </w:rPr>
+            </w:pPr>
+            <w:r>
+              <w:rPr>
+                <w:rFonts w:ascii="Arial" w:hAnsi="Arial" w:eastAsia="Arial" w:cs="Arial"/>
+                <w:i w:val="false"/>
+                <w:b w:val="false"/>
+                <w:u w:val="none"/>
+                <w:strike w:val="false"/>
+                <w:sz w:val="22"/>
+                <w:szCs w:val="22"/>
+                <w:color w:val="000000"/>
+              </w:rPr>
+              <w:t xml:space="preserve">-0.45 ± 0.14, P &lt; 0.01</w:t>
+            </w:r>
+          </w:p>
+        </w:tc>
+        <w:tc>
+          <w:tcPr>
+            <w:tcBorders>
+              <w:bottom w:val="none" w:sz="0" w:space="0" w:color="000000"/>
+              <w:top w:val="none" w:sz="0" w:space="0" w:color="000000"/>
+              <w:left w:val="none" w:sz="0" w:space="0" w:color="000000"/>
+              <w:right w:val="none" w:sz="0" w:space="0" w:color="000000"/>
+            </w:tcBorders>
+            <w:shd w:val="clear" w:color="auto" w:fill="FFFFFF"/>
+            <w:tcMar>
+              <w:top w:w="0" w:type="dxa"/>
+              <w:bottom w:w="0" w:type="dxa"/>
+              <w:left w:w="0" w:type="dxa"/>
+              <w:right w:w="0" w:type="dxa"/>
+            </w:tcMar>
+            <w:vAlign w:val="center"/>
+          </w:tcPr>
+          <w:p>
+            <w:pPr>
+              <w:jc w:val="left"/>
+              <w:pBdr>
+                <w:bottom w:val="none" w:sz="0" w:space="0" w:color="000000"/>
+                <w:top w:val="none" w:sz="0" w:space="0" w:color="000000"/>
+                <w:left w:val="none" w:sz="0" w:space="0" w:color="000000"/>
+                <w:right w:val="none" w:sz="0" w:space="0" w:color="000000"/>
+              </w:pBdr>
+              <w:spacing w:after="100" w:before="100" w:line="240"/>
+              <w:ind w:left="100" w:right="100" w:firstLine="0" w:firstLineChars="0"/>
+              <w:rPr>
+                <w:rFonts w:ascii="Arial" w:hAnsi="Arial" w:eastAsia="Arial" w:cs="Arial"/>
+                <w:i w:val="false"/>
+                <w:b w:val="false"/>
+                <w:u w:val="none"/>
+                <w:strike w:val="false"/>
+                <w:sz w:val="22"/>
+                <w:szCs w:val="22"/>
+                <w:color w:val="000000"/>
+              </w:rPr>
+            </w:pPr>
+            <w:r>
+              <w:rPr>
+                <w:rFonts w:ascii="Arial" w:hAnsi="Arial" w:eastAsia="Arial" w:cs="Arial"/>
+                <w:i w:val="false"/>
+                <w:b w:val="false"/>
+                <w:u w:val="none"/>
+                <w:strike w:val="false"/>
+                <w:sz w:val="22"/>
+                <w:szCs w:val="22"/>
+                <w:color w:val="000000"/>
+              </w:rPr>
+              <w:t xml:space="preserve">-0.45 ± 0.14, P &lt; 0.01</w:t>
             </w:r>
           </w:p>
         </w:tc>
@@ -1663,277 +1663,277 @@
                 <w:szCs w:val="22"/>
                 <w:color w:val="000000"/>
               </w:rPr>
-              <w:t xml:space="preserve">0.18 ± 0.07, P &lt; 0.01</w:t>
-            </w:r>
-          </w:p>
-        </w:tc>
-        <w:tc>
-          <w:tcPr>
-            <w:tcBorders>
-              <w:bottom w:val="none" w:sz="0" w:space="0" w:color="000000"/>
-              <w:top w:val="none" w:sz="0" w:space="0" w:color="000000"/>
-              <w:left w:val="none" w:sz="0" w:space="0" w:color="000000"/>
-              <w:right w:val="none" w:sz="0" w:space="0" w:color="000000"/>
-            </w:tcBorders>
-            <w:shd w:val="clear" w:color="auto" w:fill="FFFFFF"/>
-            <w:tcMar>
-              <w:top w:w="0" w:type="dxa"/>
-              <w:bottom w:w="0" w:type="dxa"/>
-              <w:left w:w="0" w:type="dxa"/>
-              <w:right w:w="0" w:type="dxa"/>
-            </w:tcMar>
-            <w:vAlign w:val="center"/>
-          </w:tcPr>
-          <w:p>
-            <w:pPr>
-              <w:jc w:val="left"/>
-              <w:pBdr>
-                <w:bottom w:val="none" w:sz="0" w:space="0" w:color="000000"/>
-                <w:top w:val="none" w:sz="0" w:space="0" w:color="000000"/>
-                <w:left w:val="none" w:sz="0" w:space="0" w:color="000000"/>
-                <w:right w:val="none" w:sz="0" w:space="0" w:color="000000"/>
-              </w:pBdr>
-              <w:spacing w:after="100" w:before="100" w:line="240"/>
-              <w:ind w:left="100" w:right="100" w:firstLine="0" w:firstLineChars="0"/>
-              <w:rPr>
-                <w:rFonts w:ascii="Arial" w:hAnsi="Arial" w:eastAsia="Arial" w:cs="Arial"/>
-                <w:i w:val="false"/>
-                <w:b w:val="false"/>
-                <w:u w:val="none"/>
-                <w:strike w:val="false"/>
-                <w:sz w:val="22"/>
-                <w:szCs w:val="22"/>
-                <w:color w:val="000000"/>
-              </w:rPr>
-            </w:pPr>
-            <w:r>
-              <w:rPr>
-                <w:rFonts w:ascii="Arial" w:hAnsi="Arial" w:eastAsia="Arial" w:cs="Arial"/>
-                <w:i w:val="false"/>
-                <w:b w:val="false"/>
-                <w:u w:val="none"/>
-                <w:strike w:val="false"/>
-                <w:sz w:val="22"/>
-                <w:szCs w:val="22"/>
-                <w:color w:val="000000"/>
-              </w:rPr>
-              <w:t xml:space="preserve">0.18 ± 0.07, P &lt; 0.01</w:t>
-            </w:r>
-          </w:p>
-        </w:tc>
-        <w:tc>
-          <w:tcPr>
-            <w:tcBorders>
-              <w:bottom w:val="none" w:sz="0" w:space="0" w:color="000000"/>
-              <w:top w:val="none" w:sz="0" w:space="0" w:color="000000"/>
-              <w:left w:val="none" w:sz="0" w:space="0" w:color="000000"/>
-              <w:right w:val="none" w:sz="0" w:space="0" w:color="000000"/>
-            </w:tcBorders>
-            <w:shd w:val="clear" w:color="auto" w:fill="FFFFFF"/>
-            <w:tcMar>
-              <w:top w:w="0" w:type="dxa"/>
-              <w:bottom w:w="0" w:type="dxa"/>
-              <w:left w:w="0" w:type="dxa"/>
-              <w:right w:w="0" w:type="dxa"/>
-            </w:tcMar>
-            <w:vAlign w:val="center"/>
-          </w:tcPr>
-          <w:p>
-            <w:pPr>
-              <w:jc w:val="left"/>
-              <w:pBdr>
-                <w:bottom w:val="none" w:sz="0" w:space="0" w:color="000000"/>
-                <w:top w:val="none" w:sz="0" w:space="0" w:color="000000"/>
-                <w:left w:val="none" w:sz="0" w:space="0" w:color="000000"/>
-                <w:right w:val="none" w:sz="0" w:space="0" w:color="000000"/>
-              </w:pBdr>
-              <w:spacing w:after="100" w:before="100" w:line="240"/>
-              <w:ind w:left="100" w:right="100" w:firstLine="0" w:firstLineChars="0"/>
-              <w:rPr>
-                <w:rFonts w:ascii="Arial" w:hAnsi="Arial" w:eastAsia="Arial" w:cs="Arial"/>
-                <w:i w:val="false"/>
-                <w:b w:val="false"/>
-                <w:u w:val="none"/>
-                <w:strike w:val="false"/>
-                <w:sz w:val="22"/>
-                <w:szCs w:val="22"/>
-                <w:color w:val="000000"/>
-              </w:rPr>
-            </w:pPr>
-            <w:r>
-              <w:rPr>
-                <w:rFonts w:ascii="Arial" w:hAnsi="Arial" w:eastAsia="Arial" w:cs="Arial"/>
-                <w:i w:val="false"/>
-                <w:b w:val="false"/>
-                <w:u w:val="none"/>
-                <w:strike w:val="false"/>
-                <w:sz w:val="22"/>
-                <w:szCs w:val="22"/>
-                <w:color w:val="000000"/>
-              </w:rPr>
-              <w:t xml:space="preserve">0.11 ± 0.07, P = 0.108</w:t>
-            </w:r>
-          </w:p>
-        </w:tc>
-        <w:tc>
-          <w:tcPr>
-            <w:tcBorders>
-              <w:bottom w:val="none" w:sz="0" w:space="0" w:color="000000"/>
-              <w:top w:val="none" w:sz="0" w:space="0" w:color="000000"/>
-              <w:left w:val="none" w:sz="0" w:space="0" w:color="000000"/>
-              <w:right w:val="none" w:sz="0" w:space="0" w:color="000000"/>
-            </w:tcBorders>
-            <w:shd w:val="clear" w:color="auto" w:fill="FFFFFF"/>
-            <w:tcMar>
-              <w:top w:w="0" w:type="dxa"/>
-              <w:bottom w:w="0" w:type="dxa"/>
-              <w:left w:w="0" w:type="dxa"/>
-              <w:right w:w="0" w:type="dxa"/>
-            </w:tcMar>
-            <w:vAlign w:val="center"/>
-          </w:tcPr>
-          <w:p>
-            <w:pPr>
-              <w:jc w:val="left"/>
-              <w:pBdr>
-                <w:bottom w:val="none" w:sz="0" w:space="0" w:color="000000"/>
-                <w:top w:val="none" w:sz="0" w:space="0" w:color="000000"/>
-                <w:left w:val="none" w:sz="0" w:space="0" w:color="000000"/>
-                <w:right w:val="none" w:sz="0" w:space="0" w:color="000000"/>
-              </w:pBdr>
-              <w:spacing w:after="100" w:before="100" w:line="240"/>
-              <w:ind w:left="100" w:right="100" w:firstLine="0" w:firstLineChars="0"/>
-              <w:rPr>
-                <w:rFonts w:ascii="Arial" w:hAnsi="Arial" w:eastAsia="Arial" w:cs="Arial"/>
-                <w:i w:val="false"/>
-                <w:b w:val="false"/>
-                <w:u w:val="none"/>
-                <w:strike w:val="false"/>
-                <w:sz w:val="22"/>
-                <w:szCs w:val="22"/>
-                <w:color w:val="000000"/>
-              </w:rPr>
-            </w:pPr>
-            <w:r>
-              <w:rPr>
-                <w:rFonts w:ascii="Arial" w:hAnsi="Arial" w:eastAsia="Arial" w:cs="Arial"/>
-                <w:i w:val="false"/>
-                <w:b w:val="false"/>
-                <w:u w:val="none"/>
-                <w:strike w:val="false"/>
-                <w:sz w:val="22"/>
-                <w:szCs w:val="22"/>
-                <w:color w:val="000000"/>
-              </w:rPr>
-              <w:t xml:space="preserve">0.11 ± 0.07, P = 0.104</w:t>
-            </w:r>
-          </w:p>
-        </w:tc>
-        <w:tc>
-          <w:tcPr>
-            <w:tcBorders>
-              <w:bottom w:val="none" w:sz="0" w:space="0" w:color="000000"/>
-              <w:top w:val="none" w:sz="0" w:space="0" w:color="000000"/>
-              <w:left w:val="none" w:sz="0" w:space="0" w:color="000000"/>
-              <w:right w:val="none" w:sz="0" w:space="0" w:color="000000"/>
-            </w:tcBorders>
-            <w:shd w:val="clear" w:color="auto" w:fill="FFFFFF"/>
-            <w:tcMar>
-              <w:top w:w="0" w:type="dxa"/>
-              <w:bottom w:w="0" w:type="dxa"/>
-              <w:left w:w="0" w:type="dxa"/>
-              <w:right w:w="0" w:type="dxa"/>
-            </w:tcMar>
-            <w:vAlign w:val="center"/>
-          </w:tcPr>
-          <w:p>
-            <w:pPr>
-              <w:jc w:val="left"/>
-              <w:pBdr>
-                <w:bottom w:val="none" w:sz="0" w:space="0" w:color="000000"/>
-                <w:top w:val="none" w:sz="0" w:space="0" w:color="000000"/>
-                <w:left w:val="none" w:sz="0" w:space="0" w:color="000000"/>
-                <w:right w:val="none" w:sz="0" w:space="0" w:color="000000"/>
-              </w:pBdr>
-              <w:spacing w:after="100" w:before="100" w:line="240"/>
-              <w:ind w:left="100" w:right="100" w:firstLine="0" w:firstLineChars="0"/>
-              <w:rPr>
-                <w:rFonts w:ascii="Arial" w:hAnsi="Arial" w:eastAsia="Arial" w:cs="Arial"/>
-                <w:i w:val="false"/>
-                <w:b w:val="false"/>
-                <w:u w:val="none"/>
-                <w:strike w:val="false"/>
-                <w:sz w:val="22"/>
-                <w:szCs w:val="22"/>
-                <w:color w:val="000000"/>
-              </w:rPr>
-            </w:pPr>
-            <w:r>
-              <w:rPr>
-                <w:rFonts w:ascii="Arial" w:hAnsi="Arial" w:eastAsia="Arial" w:cs="Arial"/>
-                <w:i w:val="false"/>
-                <w:b w:val="false"/>
-                <w:u w:val="none"/>
-                <w:strike w:val="false"/>
-                <w:sz w:val="22"/>
-                <w:szCs w:val="22"/>
-                <w:color w:val="000000"/>
-              </w:rPr>
-              <w:t xml:space="preserve">-0.01 ± 0.12, P = 0.947</w:t>
-            </w:r>
-          </w:p>
-        </w:tc>
-        <w:tc>
-          <w:tcPr>
-            <w:tcBorders>
-              <w:bottom w:val="none" w:sz="0" w:space="0" w:color="000000"/>
-              <w:top w:val="none" w:sz="0" w:space="0" w:color="000000"/>
-              <w:left w:val="none" w:sz="0" w:space="0" w:color="000000"/>
-              <w:right w:val="none" w:sz="0" w:space="0" w:color="000000"/>
-            </w:tcBorders>
-            <w:shd w:val="clear" w:color="auto" w:fill="FFFFFF"/>
-            <w:tcMar>
-              <w:top w:w="0" w:type="dxa"/>
-              <w:bottom w:w="0" w:type="dxa"/>
-              <w:left w:w="0" w:type="dxa"/>
-              <w:right w:w="0" w:type="dxa"/>
-            </w:tcMar>
-            <w:vAlign w:val="center"/>
-          </w:tcPr>
-          <w:p>
-            <w:pPr>
-              <w:jc w:val="left"/>
-              <w:pBdr>
-                <w:bottom w:val="none" w:sz="0" w:space="0" w:color="000000"/>
-                <w:top w:val="none" w:sz="0" w:space="0" w:color="000000"/>
-                <w:left w:val="none" w:sz="0" w:space="0" w:color="000000"/>
-                <w:right w:val="none" w:sz="0" w:space="0" w:color="000000"/>
-              </w:pBdr>
-              <w:spacing w:after="100" w:before="100" w:line="240"/>
-              <w:ind w:left="100" w:right="100" w:firstLine="0" w:firstLineChars="0"/>
-              <w:rPr>
-                <w:rFonts w:ascii="Arial" w:hAnsi="Arial" w:eastAsia="Arial" w:cs="Arial"/>
-                <w:i w:val="false"/>
-                <w:b w:val="false"/>
-                <w:u w:val="none"/>
-                <w:strike w:val="false"/>
-                <w:sz w:val="22"/>
-                <w:szCs w:val="22"/>
-                <w:color w:val="000000"/>
-              </w:rPr>
-            </w:pPr>
-            <w:r>
-              <w:rPr>
-                <w:rFonts w:ascii="Arial" w:hAnsi="Arial" w:eastAsia="Arial" w:cs="Arial"/>
-                <w:i w:val="false"/>
-                <w:b w:val="false"/>
-                <w:u w:val="none"/>
-                <w:strike w:val="false"/>
-                <w:sz w:val="22"/>
-                <w:szCs w:val="22"/>
-                <w:color w:val="000000"/>
-              </w:rPr>
-              <w:t xml:space="preserve">0.01 ± 0.12, P = 0.956</w:t>
+              <w:t xml:space="preserve">0.11 ± 0.09, P = 0.205</w:t>
+            </w:r>
+          </w:p>
+        </w:tc>
+        <w:tc>
+          <w:tcPr>
+            <w:tcBorders>
+              <w:bottom w:val="none" w:sz="0" w:space="0" w:color="000000"/>
+              <w:top w:val="none" w:sz="0" w:space="0" w:color="000000"/>
+              <w:left w:val="none" w:sz="0" w:space="0" w:color="000000"/>
+              <w:right w:val="none" w:sz="0" w:space="0" w:color="000000"/>
+            </w:tcBorders>
+            <w:shd w:val="clear" w:color="auto" w:fill="FFFFFF"/>
+            <w:tcMar>
+              <w:top w:w="0" w:type="dxa"/>
+              <w:bottom w:w="0" w:type="dxa"/>
+              <w:left w:w="0" w:type="dxa"/>
+              <w:right w:w="0" w:type="dxa"/>
+            </w:tcMar>
+            <w:vAlign w:val="center"/>
+          </w:tcPr>
+          <w:p>
+            <w:pPr>
+              <w:jc w:val="left"/>
+              <w:pBdr>
+                <w:bottom w:val="none" w:sz="0" w:space="0" w:color="000000"/>
+                <w:top w:val="none" w:sz="0" w:space="0" w:color="000000"/>
+                <w:left w:val="none" w:sz="0" w:space="0" w:color="000000"/>
+                <w:right w:val="none" w:sz="0" w:space="0" w:color="000000"/>
+              </w:pBdr>
+              <w:spacing w:after="100" w:before="100" w:line="240"/>
+              <w:ind w:left="100" w:right="100" w:firstLine="0" w:firstLineChars="0"/>
+              <w:rPr>
+                <w:rFonts w:ascii="Arial" w:hAnsi="Arial" w:eastAsia="Arial" w:cs="Arial"/>
+                <w:i w:val="false"/>
+                <w:b w:val="false"/>
+                <w:u w:val="none"/>
+                <w:strike w:val="false"/>
+                <w:sz w:val="22"/>
+                <w:szCs w:val="22"/>
+                <w:color w:val="000000"/>
+              </w:rPr>
+            </w:pPr>
+            <w:r>
+              <w:rPr>
+                <w:rFonts w:ascii="Arial" w:hAnsi="Arial" w:eastAsia="Arial" w:cs="Arial"/>
+                <w:i w:val="false"/>
+                <w:b w:val="false"/>
+                <w:u w:val="none"/>
+                <w:strike w:val="false"/>
+                <w:sz w:val="22"/>
+                <w:szCs w:val="22"/>
+                <w:color w:val="000000"/>
+              </w:rPr>
+              <w:t xml:space="preserve">0.11 ± 0.09, P = 0.208</w:t>
+            </w:r>
+          </w:p>
+        </w:tc>
+        <w:tc>
+          <w:tcPr>
+            <w:tcBorders>
+              <w:bottom w:val="none" w:sz="0" w:space="0" w:color="000000"/>
+              <w:top w:val="none" w:sz="0" w:space="0" w:color="000000"/>
+              <w:left w:val="none" w:sz="0" w:space="0" w:color="000000"/>
+              <w:right w:val="none" w:sz="0" w:space="0" w:color="000000"/>
+            </w:tcBorders>
+            <w:shd w:val="clear" w:color="auto" w:fill="FFFFFF"/>
+            <w:tcMar>
+              <w:top w:w="0" w:type="dxa"/>
+              <w:bottom w:w="0" w:type="dxa"/>
+              <w:left w:w="0" w:type="dxa"/>
+              <w:right w:w="0" w:type="dxa"/>
+            </w:tcMar>
+            <w:vAlign w:val="center"/>
+          </w:tcPr>
+          <w:p>
+            <w:pPr>
+              <w:jc w:val="left"/>
+              <w:pBdr>
+                <w:bottom w:val="none" w:sz="0" w:space="0" w:color="000000"/>
+                <w:top w:val="none" w:sz="0" w:space="0" w:color="000000"/>
+                <w:left w:val="none" w:sz="0" w:space="0" w:color="000000"/>
+                <w:right w:val="none" w:sz="0" w:space="0" w:color="000000"/>
+              </w:pBdr>
+              <w:spacing w:after="100" w:before="100" w:line="240"/>
+              <w:ind w:left="100" w:right="100" w:firstLine="0" w:firstLineChars="0"/>
+              <w:rPr>
+                <w:rFonts w:ascii="Arial" w:hAnsi="Arial" w:eastAsia="Arial" w:cs="Arial"/>
+                <w:i w:val="false"/>
+                <w:b w:val="false"/>
+                <w:u w:val="none"/>
+                <w:strike w:val="false"/>
+                <w:sz w:val="22"/>
+                <w:szCs w:val="22"/>
+                <w:color w:val="000000"/>
+              </w:rPr>
+            </w:pPr>
+            <w:r>
+              <w:rPr>
+                <w:rFonts w:ascii="Arial" w:hAnsi="Arial" w:eastAsia="Arial" w:cs="Arial"/>
+                <w:i w:val="false"/>
+                <w:b w:val="false"/>
+                <w:u w:val="none"/>
+                <w:strike w:val="false"/>
+                <w:sz w:val="22"/>
+                <w:szCs w:val="22"/>
+                <w:color w:val="000000"/>
+              </w:rPr>
+              <w:t xml:space="preserve">0.13 ± 0.08, P = 0.104</w:t>
+            </w:r>
+          </w:p>
+        </w:tc>
+        <w:tc>
+          <w:tcPr>
+            <w:tcBorders>
+              <w:bottom w:val="none" w:sz="0" w:space="0" w:color="000000"/>
+              <w:top w:val="none" w:sz="0" w:space="0" w:color="000000"/>
+              <w:left w:val="none" w:sz="0" w:space="0" w:color="000000"/>
+              <w:right w:val="none" w:sz="0" w:space="0" w:color="000000"/>
+            </w:tcBorders>
+            <w:shd w:val="clear" w:color="auto" w:fill="FFFFFF"/>
+            <w:tcMar>
+              <w:top w:w="0" w:type="dxa"/>
+              <w:bottom w:w="0" w:type="dxa"/>
+              <w:left w:w="0" w:type="dxa"/>
+              <w:right w:w="0" w:type="dxa"/>
+            </w:tcMar>
+            <w:vAlign w:val="center"/>
+          </w:tcPr>
+          <w:p>
+            <w:pPr>
+              <w:jc w:val="left"/>
+              <w:pBdr>
+                <w:bottom w:val="none" w:sz="0" w:space="0" w:color="000000"/>
+                <w:top w:val="none" w:sz="0" w:space="0" w:color="000000"/>
+                <w:left w:val="none" w:sz="0" w:space="0" w:color="000000"/>
+                <w:right w:val="none" w:sz="0" w:space="0" w:color="000000"/>
+              </w:pBdr>
+              <w:spacing w:after="100" w:before="100" w:line="240"/>
+              <w:ind w:left="100" w:right="100" w:firstLine="0" w:firstLineChars="0"/>
+              <w:rPr>
+                <w:rFonts w:ascii="Arial" w:hAnsi="Arial" w:eastAsia="Arial" w:cs="Arial"/>
+                <w:i w:val="false"/>
+                <w:b w:val="false"/>
+                <w:u w:val="none"/>
+                <w:strike w:val="false"/>
+                <w:sz w:val="22"/>
+                <w:szCs w:val="22"/>
+                <w:color w:val="000000"/>
+              </w:rPr>
+            </w:pPr>
+            <w:r>
+              <w:rPr>
+                <w:rFonts w:ascii="Arial" w:hAnsi="Arial" w:eastAsia="Arial" w:cs="Arial"/>
+                <w:i w:val="false"/>
+                <w:b w:val="false"/>
+                <w:u w:val="none"/>
+                <w:strike w:val="false"/>
+                <w:sz w:val="22"/>
+                <w:szCs w:val="22"/>
+                <w:color w:val="000000"/>
+              </w:rPr>
+              <w:t xml:space="preserve">0.14 ± 0.08, P = 0.065</w:t>
+            </w:r>
+          </w:p>
+        </w:tc>
+        <w:tc>
+          <w:tcPr>
+            <w:tcBorders>
+              <w:bottom w:val="none" w:sz="0" w:space="0" w:color="000000"/>
+              <w:top w:val="none" w:sz="0" w:space="0" w:color="000000"/>
+              <w:left w:val="none" w:sz="0" w:space="0" w:color="000000"/>
+              <w:right w:val="none" w:sz="0" w:space="0" w:color="000000"/>
+            </w:tcBorders>
+            <w:shd w:val="clear" w:color="auto" w:fill="FFFFFF"/>
+            <w:tcMar>
+              <w:top w:w="0" w:type="dxa"/>
+              <w:bottom w:w="0" w:type="dxa"/>
+              <w:left w:w="0" w:type="dxa"/>
+              <w:right w:w="0" w:type="dxa"/>
+            </w:tcMar>
+            <w:vAlign w:val="center"/>
+          </w:tcPr>
+          <w:p>
+            <w:pPr>
+              <w:jc w:val="left"/>
+              <w:pBdr>
+                <w:bottom w:val="none" w:sz="0" w:space="0" w:color="000000"/>
+                <w:top w:val="none" w:sz="0" w:space="0" w:color="000000"/>
+                <w:left w:val="none" w:sz="0" w:space="0" w:color="000000"/>
+                <w:right w:val="none" w:sz="0" w:space="0" w:color="000000"/>
+              </w:pBdr>
+              <w:spacing w:after="100" w:before="100" w:line="240"/>
+              <w:ind w:left="100" w:right="100" w:firstLine="0" w:firstLineChars="0"/>
+              <w:rPr>
+                <w:rFonts w:ascii="Arial" w:hAnsi="Arial" w:eastAsia="Arial" w:cs="Arial"/>
+                <w:i w:val="false"/>
+                <w:b w:val="false"/>
+                <w:u w:val="none"/>
+                <w:strike w:val="false"/>
+                <w:sz w:val="22"/>
+                <w:szCs w:val="22"/>
+                <w:color w:val="000000"/>
+              </w:rPr>
+            </w:pPr>
+            <w:r>
+              <w:rPr>
+                <w:rFonts w:ascii="Arial" w:hAnsi="Arial" w:eastAsia="Arial" w:cs="Arial"/>
+                <w:i w:val="false"/>
+                <w:b w:val="false"/>
+                <w:u w:val="none"/>
+                <w:strike w:val="false"/>
+                <w:sz w:val="22"/>
+                <w:szCs w:val="22"/>
+                <w:color w:val="000000"/>
+              </w:rPr>
+              <w:t xml:space="preserve">-0.06 ± 0.15, P = 0.675</w:t>
+            </w:r>
+          </w:p>
+        </w:tc>
+        <w:tc>
+          <w:tcPr>
+            <w:tcBorders>
+              <w:bottom w:val="none" w:sz="0" w:space="0" w:color="000000"/>
+              <w:top w:val="none" w:sz="0" w:space="0" w:color="000000"/>
+              <w:left w:val="none" w:sz="0" w:space="0" w:color="000000"/>
+              <w:right w:val="none" w:sz="0" w:space="0" w:color="000000"/>
+            </w:tcBorders>
+            <w:shd w:val="clear" w:color="auto" w:fill="FFFFFF"/>
+            <w:tcMar>
+              <w:top w:w="0" w:type="dxa"/>
+              <w:bottom w:w="0" w:type="dxa"/>
+              <w:left w:w="0" w:type="dxa"/>
+              <w:right w:w="0" w:type="dxa"/>
+            </w:tcMar>
+            <w:vAlign w:val="center"/>
+          </w:tcPr>
+          <w:p>
+            <w:pPr>
+              <w:jc w:val="left"/>
+              <w:pBdr>
+                <w:bottom w:val="none" w:sz="0" w:space="0" w:color="000000"/>
+                <w:top w:val="none" w:sz="0" w:space="0" w:color="000000"/>
+                <w:left w:val="none" w:sz="0" w:space="0" w:color="000000"/>
+                <w:right w:val="none" w:sz="0" w:space="0" w:color="000000"/>
+              </w:pBdr>
+              <w:spacing w:after="100" w:before="100" w:line="240"/>
+              <w:ind w:left="100" w:right="100" w:firstLine="0" w:firstLineChars="0"/>
+              <w:rPr>
+                <w:rFonts w:ascii="Arial" w:hAnsi="Arial" w:eastAsia="Arial" w:cs="Arial"/>
+                <w:i w:val="false"/>
+                <w:b w:val="false"/>
+                <w:u w:val="none"/>
+                <w:strike w:val="false"/>
+                <w:sz w:val="22"/>
+                <w:szCs w:val="22"/>
+                <w:color w:val="000000"/>
+              </w:rPr>
+            </w:pPr>
+            <w:r>
+              <w:rPr>
+                <w:rFonts w:ascii="Arial" w:hAnsi="Arial" w:eastAsia="Arial" w:cs="Arial"/>
+                <w:i w:val="false"/>
+                <w:b w:val="false"/>
+                <w:u w:val="none"/>
+                <w:strike w:val="false"/>
+                <w:sz w:val="22"/>
+                <w:szCs w:val="22"/>
+                <w:color w:val="000000"/>
+              </w:rPr>
+              <w:t xml:space="preserve">-0.03 ± 0.15, P = 0.838</w:t>
             </w:r>
           </w:p>
         </w:tc>
@@ -2047,277 +2047,277 @@
                 <w:szCs w:val="22"/>
                 <w:color w:val="000000"/>
               </w:rPr>
-              <w:t xml:space="preserve">-0.35 ± 0.13, P &lt; 0.01</w:t>
-            </w:r>
-          </w:p>
-        </w:tc>
-        <w:tc>
-          <w:tcPr>
-            <w:tcBorders>
-              <w:bottom w:val="none" w:sz="0" w:space="0" w:color="000000"/>
-              <w:top w:val="none" w:sz="0" w:space="0" w:color="000000"/>
-              <w:left w:val="none" w:sz="0" w:space="0" w:color="000000"/>
-              <w:right w:val="none" w:sz="0" w:space="0" w:color="000000"/>
-            </w:tcBorders>
-            <w:shd w:val="clear" w:color="auto" w:fill="FFFFFF"/>
-            <w:tcMar>
-              <w:top w:w="0" w:type="dxa"/>
-              <w:bottom w:w="0" w:type="dxa"/>
-              <w:left w:w="0" w:type="dxa"/>
-              <w:right w:w="0" w:type="dxa"/>
-            </w:tcMar>
-            <w:vAlign w:val="center"/>
-          </w:tcPr>
-          <w:p>
-            <w:pPr>
-              <w:jc w:val="left"/>
-              <w:pBdr>
-                <w:bottom w:val="none" w:sz="0" w:space="0" w:color="000000"/>
-                <w:top w:val="none" w:sz="0" w:space="0" w:color="000000"/>
-                <w:left w:val="none" w:sz="0" w:space="0" w:color="000000"/>
-                <w:right w:val="none" w:sz="0" w:space="0" w:color="000000"/>
-              </w:pBdr>
-              <w:spacing w:after="100" w:before="100" w:line="240"/>
-              <w:ind w:left="100" w:right="100" w:firstLine="0" w:firstLineChars="0"/>
-              <w:rPr>
-                <w:rFonts w:ascii="Arial" w:hAnsi="Arial" w:eastAsia="Arial" w:cs="Arial"/>
-                <w:i w:val="false"/>
-                <w:b w:val="false"/>
-                <w:u w:val="none"/>
-                <w:strike w:val="false"/>
-                <w:sz w:val="22"/>
-                <w:szCs w:val="22"/>
-                <w:color w:val="000000"/>
-              </w:rPr>
-            </w:pPr>
-            <w:r>
-              <w:rPr>
-                <w:rFonts w:ascii="Arial" w:hAnsi="Arial" w:eastAsia="Arial" w:cs="Arial"/>
-                <w:i w:val="false"/>
-                <w:b w:val="false"/>
-                <w:u w:val="none"/>
-                <w:strike w:val="false"/>
-                <w:sz w:val="22"/>
-                <w:szCs w:val="22"/>
-                <w:color w:val="000000"/>
-              </w:rPr>
-              <w:t xml:space="preserve">-0.37 ± 0.12, P &lt; 0.01</w:t>
-            </w:r>
-          </w:p>
-        </w:tc>
-        <w:tc>
-          <w:tcPr>
-            <w:tcBorders>
-              <w:bottom w:val="none" w:sz="0" w:space="0" w:color="000000"/>
-              <w:top w:val="none" w:sz="0" w:space="0" w:color="000000"/>
-              <w:left w:val="none" w:sz="0" w:space="0" w:color="000000"/>
-              <w:right w:val="none" w:sz="0" w:space="0" w:color="000000"/>
-            </w:tcBorders>
-            <w:shd w:val="clear" w:color="auto" w:fill="FFFFFF"/>
-            <w:tcMar>
-              <w:top w:w="0" w:type="dxa"/>
-              <w:bottom w:w="0" w:type="dxa"/>
-              <w:left w:w="0" w:type="dxa"/>
-              <w:right w:w="0" w:type="dxa"/>
-            </w:tcMar>
-            <w:vAlign w:val="center"/>
-          </w:tcPr>
-          <w:p>
-            <w:pPr>
-              <w:jc w:val="left"/>
-              <w:pBdr>
-                <w:bottom w:val="none" w:sz="0" w:space="0" w:color="000000"/>
-                <w:top w:val="none" w:sz="0" w:space="0" w:color="000000"/>
-                <w:left w:val="none" w:sz="0" w:space="0" w:color="000000"/>
-                <w:right w:val="none" w:sz="0" w:space="0" w:color="000000"/>
-              </w:pBdr>
-              <w:spacing w:after="100" w:before="100" w:line="240"/>
-              <w:ind w:left="100" w:right="100" w:firstLine="0" w:firstLineChars="0"/>
-              <w:rPr>
-                <w:rFonts w:ascii="Arial" w:hAnsi="Arial" w:eastAsia="Arial" w:cs="Arial"/>
-                <w:i w:val="false"/>
-                <w:b w:val="false"/>
-                <w:u w:val="none"/>
-                <w:strike w:val="false"/>
-                <w:sz w:val="22"/>
-                <w:szCs w:val="22"/>
-                <w:color w:val="000000"/>
-              </w:rPr>
-            </w:pPr>
-            <w:r>
-              <w:rPr>
-                <w:rFonts w:ascii="Arial" w:hAnsi="Arial" w:eastAsia="Arial" w:cs="Arial"/>
-                <w:i w:val="false"/>
-                <w:b w:val="false"/>
-                <w:u w:val="none"/>
-                <w:strike w:val="false"/>
-                <w:sz w:val="22"/>
-                <w:szCs w:val="22"/>
-                <w:color w:val="000000"/>
-              </w:rPr>
-              <w:t xml:space="preserve">-0.23 ± 0.12, P &lt; 0.05</w:t>
-            </w:r>
-          </w:p>
-        </w:tc>
-        <w:tc>
-          <w:tcPr>
-            <w:tcBorders>
-              <w:bottom w:val="none" w:sz="0" w:space="0" w:color="000000"/>
-              <w:top w:val="none" w:sz="0" w:space="0" w:color="000000"/>
-              <w:left w:val="none" w:sz="0" w:space="0" w:color="000000"/>
-              <w:right w:val="none" w:sz="0" w:space="0" w:color="000000"/>
-            </w:tcBorders>
-            <w:shd w:val="clear" w:color="auto" w:fill="FFFFFF"/>
-            <w:tcMar>
-              <w:top w:w="0" w:type="dxa"/>
-              <w:bottom w:w="0" w:type="dxa"/>
-              <w:left w:w="0" w:type="dxa"/>
-              <w:right w:w="0" w:type="dxa"/>
-            </w:tcMar>
-            <w:vAlign w:val="center"/>
-          </w:tcPr>
-          <w:p>
-            <w:pPr>
-              <w:jc w:val="left"/>
-              <w:pBdr>
-                <w:bottom w:val="none" w:sz="0" w:space="0" w:color="000000"/>
-                <w:top w:val="none" w:sz="0" w:space="0" w:color="000000"/>
-                <w:left w:val="none" w:sz="0" w:space="0" w:color="000000"/>
-                <w:right w:val="none" w:sz="0" w:space="0" w:color="000000"/>
-              </w:pBdr>
-              <w:spacing w:after="100" w:before="100" w:line="240"/>
-              <w:ind w:left="100" w:right="100" w:firstLine="0" w:firstLineChars="0"/>
-              <w:rPr>
-                <w:rFonts w:ascii="Arial" w:hAnsi="Arial" w:eastAsia="Arial" w:cs="Arial"/>
-                <w:i w:val="false"/>
-                <w:b w:val="false"/>
-                <w:u w:val="none"/>
-                <w:strike w:val="false"/>
-                <w:sz w:val="22"/>
-                <w:szCs w:val="22"/>
-                <w:color w:val="000000"/>
-              </w:rPr>
-            </w:pPr>
-            <w:r>
-              <w:rPr>
-                <w:rFonts w:ascii="Arial" w:hAnsi="Arial" w:eastAsia="Arial" w:cs="Arial"/>
-                <w:i w:val="false"/>
-                <w:b w:val="false"/>
-                <w:u w:val="none"/>
-                <w:strike w:val="false"/>
-                <w:sz w:val="22"/>
-                <w:szCs w:val="22"/>
-                <w:color w:val="000000"/>
-              </w:rPr>
-              <w:t xml:space="preserve">-0.17 ± 0.14, P = 0.228</w:t>
-            </w:r>
-          </w:p>
-        </w:tc>
-        <w:tc>
-          <w:tcPr>
-            <w:tcBorders>
-              <w:bottom w:val="none" w:sz="0" w:space="0" w:color="000000"/>
-              <w:top w:val="none" w:sz="0" w:space="0" w:color="000000"/>
-              <w:left w:val="none" w:sz="0" w:space="0" w:color="000000"/>
-              <w:right w:val="none" w:sz="0" w:space="0" w:color="000000"/>
-            </w:tcBorders>
-            <w:shd w:val="clear" w:color="auto" w:fill="FFFFFF"/>
-            <w:tcMar>
-              <w:top w:w="0" w:type="dxa"/>
-              <w:bottom w:w="0" w:type="dxa"/>
-              <w:left w:w="0" w:type="dxa"/>
-              <w:right w:w="0" w:type="dxa"/>
-            </w:tcMar>
-            <w:vAlign w:val="center"/>
-          </w:tcPr>
-          <w:p>
-            <w:pPr>
-              <w:jc w:val="left"/>
-              <w:pBdr>
-                <w:bottom w:val="none" w:sz="0" w:space="0" w:color="000000"/>
-                <w:top w:val="none" w:sz="0" w:space="0" w:color="000000"/>
-                <w:left w:val="none" w:sz="0" w:space="0" w:color="000000"/>
-                <w:right w:val="none" w:sz="0" w:space="0" w:color="000000"/>
-              </w:pBdr>
-              <w:spacing w:after="100" w:before="100" w:line="240"/>
-              <w:ind w:left="100" w:right="100" w:firstLine="0" w:firstLineChars="0"/>
-              <w:rPr>
-                <w:rFonts w:ascii="Arial" w:hAnsi="Arial" w:eastAsia="Arial" w:cs="Arial"/>
-                <w:i w:val="false"/>
-                <w:b w:val="false"/>
-                <w:u w:val="none"/>
-                <w:strike w:val="false"/>
-                <w:sz w:val="22"/>
-                <w:szCs w:val="22"/>
-                <w:color w:val="000000"/>
-              </w:rPr>
-            </w:pPr>
-            <w:r>
-              <w:rPr>
-                <w:rFonts w:ascii="Arial" w:hAnsi="Arial" w:eastAsia="Arial" w:cs="Arial"/>
-                <w:i w:val="false"/>
-                <w:b w:val="false"/>
-                <w:u w:val="none"/>
-                <w:strike w:val="false"/>
-                <w:sz w:val="22"/>
-                <w:szCs w:val="22"/>
-                <w:color w:val="000000"/>
-              </w:rPr>
-              <w:t xml:space="preserve">0.05 ± 1.3, P = 0.967</w:t>
-            </w:r>
-          </w:p>
-        </w:tc>
-        <w:tc>
-          <w:tcPr>
-            <w:tcBorders>
-              <w:bottom w:val="none" w:sz="0" w:space="0" w:color="000000"/>
-              <w:top w:val="none" w:sz="0" w:space="0" w:color="000000"/>
-              <w:left w:val="none" w:sz="0" w:space="0" w:color="000000"/>
-              <w:right w:val="none" w:sz="0" w:space="0" w:color="000000"/>
-            </w:tcBorders>
-            <w:shd w:val="clear" w:color="auto" w:fill="FFFFFF"/>
-            <w:tcMar>
-              <w:top w:w="0" w:type="dxa"/>
-              <w:bottom w:w="0" w:type="dxa"/>
-              <w:left w:w="0" w:type="dxa"/>
-              <w:right w:w="0" w:type="dxa"/>
-            </w:tcMar>
-            <w:vAlign w:val="center"/>
-          </w:tcPr>
-          <w:p>
-            <w:pPr>
-              <w:jc w:val="left"/>
-              <w:pBdr>
-                <w:bottom w:val="none" w:sz="0" w:space="0" w:color="000000"/>
-                <w:top w:val="none" w:sz="0" w:space="0" w:color="000000"/>
-                <w:left w:val="none" w:sz="0" w:space="0" w:color="000000"/>
-                <w:right w:val="none" w:sz="0" w:space="0" w:color="000000"/>
-              </w:pBdr>
-              <w:spacing w:after="100" w:before="100" w:line="240"/>
-              <w:ind w:left="100" w:right="100" w:firstLine="0" w:firstLineChars="0"/>
-              <w:rPr>
-                <w:rFonts w:ascii="Arial" w:hAnsi="Arial" w:eastAsia="Arial" w:cs="Arial"/>
-                <w:i w:val="false"/>
-                <w:b w:val="false"/>
-                <w:u w:val="none"/>
-                <w:strike w:val="false"/>
-                <w:sz w:val="22"/>
-                <w:szCs w:val="22"/>
-                <w:color w:val="000000"/>
-              </w:rPr>
-            </w:pPr>
-            <w:r>
-              <w:rPr>
-                <w:rFonts w:ascii="Arial" w:hAnsi="Arial" w:eastAsia="Arial" w:cs="Arial"/>
-                <w:i w:val="false"/>
-                <w:b w:val="false"/>
-                <w:u w:val="none"/>
-                <w:strike w:val="false"/>
-                <w:sz w:val="22"/>
-                <w:szCs w:val="22"/>
-                <w:color w:val="000000"/>
-              </w:rPr>
-              <w:t xml:space="preserve">0.69 ± 1.45, P = 0.636</w:t>
+              <w:t xml:space="preserve">-0.54 ± 0.11, P &lt; 0.001</w:t>
+            </w:r>
+          </w:p>
+        </w:tc>
+        <w:tc>
+          <w:tcPr>
+            <w:tcBorders>
+              <w:bottom w:val="none" w:sz="0" w:space="0" w:color="000000"/>
+              <w:top w:val="none" w:sz="0" w:space="0" w:color="000000"/>
+              <w:left w:val="none" w:sz="0" w:space="0" w:color="000000"/>
+              <w:right w:val="none" w:sz="0" w:space="0" w:color="000000"/>
+            </w:tcBorders>
+            <w:shd w:val="clear" w:color="auto" w:fill="FFFFFF"/>
+            <w:tcMar>
+              <w:top w:w="0" w:type="dxa"/>
+              <w:bottom w:w="0" w:type="dxa"/>
+              <w:left w:w="0" w:type="dxa"/>
+              <w:right w:w="0" w:type="dxa"/>
+            </w:tcMar>
+            <w:vAlign w:val="center"/>
+          </w:tcPr>
+          <w:p>
+            <w:pPr>
+              <w:jc w:val="left"/>
+              <w:pBdr>
+                <w:bottom w:val="none" w:sz="0" w:space="0" w:color="000000"/>
+                <w:top w:val="none" w:sz="0" w:space="0" w:color="000000"/>
+                <w:left w:val="none" w:sz="0" w:space="0" w:color="000000"/>
+                <w:right w:val="none" w:sz="0" w:space="0" w:color="000000"/>
+              </w:pBdr>
+              <w:spacing w:after="100" w:before="100" w:line="240"/>
+              <w:ind w:left="100" w:right="100" w:firstLine="0" w:firstLineChars="0"/>
+              <w:rPr>
+                <w:rFonts w:ascii="Arial" w:hAnsi="Arial" w:eastAsia="Arial" w:cs="Arial"/>
+                <w:i w:val="false"/>
+                <w:b w:val="false"/>
+                <w:u w:val="none"/>
+                <w:strike w:val="false"/>
+                <w:sz w:val="22"/>
+                <w:szCs w:val="22"/>
+                <w:color w:val="000000"/>
+              </w:rPr>
+            </w:pPr>
+            <w:r>
+              <w:rPr>
+                <w:rFonts w:ascii="Arial" w:hAnsi="Arial" w:eastAsia="Arial" w:cs="Arial"/>
+                <w:i w:val="false"/>
+                <w:b w:val="false"/>
+                <w:u w:val="none"/>
+                <w:strike w:val="false"/>
+                <w:sz w:val="22"/>
+                <w:szCs w:val="22"/>
+                <w:color w:val="000000"/>
+              </w:rPr>
+              <w:t xml:space="preserve">-0.54 ± 0.11, P &lt; 0.001</w:t>
+            </w:r>
+          </w:p>
+        </w:tc>
+        <w:tc>
+          <w:tcPr>
+            <w:tcBorders>
+              <w:bottom w:val="none" w:sz="0" w:space="0" w:color="000000"/>
+              <w:top w:val="none" w:sz="0" w:space="0" w:color="000000"/>
+              <w:left w:val="none" w:sz="0" w:space="0" w:color="000000"/>
+              <w:right w:val="none" w:sz="0" w:space="0" w:color="000000"/>
+            </w:tcBorders>
+            <w:shd w:val="clear" w:color="auto" w:fill="FFFFFF"/>
+            <w:tcMar>
+              <w:top w:w="0" w:type="dxa"/>
+              <w:bottom w:w="0" w:type="dxa"/>
+              <w:left w:w="0" w:type="dxa"/>
+              <w:right w:w="0" w:type="dxa"/>
+            </w:tcMar>
+            <w:vAlign w:val="center"/>
+          </w:tcPr>
+          <w:p>
+            <w:pPr>
+              <w:jc w:val="left"/>
+              <w:pBdr>
+                <w:bottom w:val="none" w:sz="0" w:space="0" w:color="000000"/>
+                <w:top w:val="none" w:sz="0" w:space="0" w:color="000000"/>
+                <w:left w:val="none" w:sz="0" w:space="0" w:color="000000"/>
+                <w:right w:val="none" w:sz="0" w:space="0" w:color="000000"/>
+              </w:pBdr>
+              <w:spacing w:after="100" w:before="100" w:line="240"/>
+              <w:ind w:left="100" w:right="100" w:firstLine="0" w:firstLineChars="0"/>
+              <w:rPr>
+                <w:rFonts w:ascii="Arial" w:hAnsi="Arial" w:eastAsia="Arial" w:cs="Arial"/>
+                <w:i w:val="false"/>
+                <w:b w:val="false"/>
+                <w:u w:val="none"/>
+                <w:strike w:val="false"/>
+                <w:sz w:val="22"/>
+                <w:szCs w:val="22"/>
+                <w:color w:val="000000"/>
+              </w:rPr>
+            </w:pPr>
+            <w:r>
+              <w:rPr>
+                <w:rFonts w:ascii="Arial" w:hAnsi="Arial" w:eastAsia="Arial" w:cs="Arial"/>
+                <w:i w:val="false"/>
+                <w:b w:val="false"/>
+                <w:u w:val="none"/>
+                <w:strike w:val="false"/>
+                <w:sz w:val="22"/>
+                <w:szCs w:val="22"/>
+                <w:color w:val="000000"/>
+              </w:rPr>
+              <w:t xml:space="preserve">-0.4 ± 0.09, P &lt; 0.001</w:t>
+            </w:r>
+          </w:p>
+        </w:tc>
+        <w:tc>
+          <w:tcPr>
+            <w:tcBorders>
+              <w:bottom w:val="none" w:sz="0" w:space="0" w:color="000000"/>
+              <w:top w:val="none" w:sz="0" w:space="0" w:color="000000"/>
+              <w:left w:val="none" w:sz="0" w:space="0" w:color="000000"/>
+              <w:right w:val="none" w:sz="0" w:space="0" w:color="000000"/>
+            </w:tcBorders>
+            <w:shd w:val="clear" w:color="auto" w:fill="FFFFFF"/>
+            <w:tcMar>
+              <w:top w:w="0" w:type="dxa"/>
+              <w:bottom w:w="0" w:type="dxa"/>
+              <w:left w:w="0" w:type="dxa"/>
+              <w:right w:w="0" w:type="dxa"/>
+            </w:tcMar>
+            <w:vAlign w:val="center"/>
+          </w:tcPr>
+          <w:p>
+            <w:pPr>
+              <w:jc w:val="left"/>
+              <w:pBdr>
+                <w:bottom w:val="none" w:sz="0" w:space="0" w:color="000000"/>
+                <w:top w:val="none" w:sz="0" w:space="0" w:color="000000"/>
+                <w:left w:val="none" w:sz="0" w:space="0" w:color="000000"/>
+                <w:right w:val="none" w:sz="0" w:space="0" w:color="000000"/>
+              </w:pBdr>
+              <w:spacing w:after="100" w:before="100" w:line="240"/>
+              <w:ind w:left="100" w:right="100" w:firstLine="0" w:firstLineChars="0"/>
+              <w:rPr>
+                <w:rFonts w:ascii="Arial" w:hAnsi="Arial" w:eastAsia="Arial" w:cs="Arial"/>
+                <w:i w:val="false"/>
+                <w:b w:val="false"/>
+                <w:u w:val="none"/>
+                <w:strike w:val="false"/>
+                <w:sz w:val="22"/>
+                <w:szCs w:val="22"/>
+                <w:color w:val="000000"/>
+              </w:rPr>
+            </w:pPr>
+            <w:r>
+              <w:rPr>
+                <w:rFonts w:ascii="Arial" w:hAnsi="Arial" w:eastAsia="Arial" w:cs="Arial"/>
+                <w:i w:val="false"/>
+                <w:b w:val="false"/>
+                <w:u w:val="none"/>
+                <w:strike w:val="false"/>
+                <w:sz w:val="22"/>
+                <w:szCs w:val="22"/>
+                <w:color w:val="000000"/>
+              </w:rPr>
+              <w:t xml:space="preserve">-0.36 ± 0.09, P &lt; 0.001</w:t>
+            </w:r>
+          </w:p>
+        </w:tc>
+        <w:tc>
+          <w:tcPr>
+            <w:tcBorders>
+              <w:bottom w:val="none" w:sz="0" w:space="0" w:color="000000"/>
+              <w:top w:val="none" w:sz="0" w:space="0" w:color="000000"/>
+              <w:left w:val="none" w:sz="0" w:space="0" w:color="000000"/>
+              <w:right w:val="none" w:sz="0" w:space="0" w:color="000000"/>
+            </w:tcBorders>
+            <w:shd w:val="clear" w:color="auto" w:fill="FFFFFF"/>
+            <w:tcMar>
+              <w:top w:w="0" w:type="dxa"/>
+              <w:bottom w:w="0" w:type="dxa"/>
+              <w:left w:w="0" w:type="dxa"/>
+              <w:right w:w="0" w:type="dxa"/>
+            </w:tcMar>
+            <w:vAlign w:val="center"/>
+          </w:tcPr>
+          <w:p>
+            <w:pPr>
+              <w:jc w:val="left"/>
+              <w:pBdr>
+                <w:bottom w:val="none" w:sz="0" w:space="0" w:color="000000"/>
+                <w:top w:val="none" w:sz="0" w:space="0" w:color="000000"/>
+                <w:left w:val="none" w:sz="0" w:space="0" w:color="000000"/>
+                <w:right w:val="none" w:sz="0" w:space="0" w:color="000000"/>
+              </w:pBdr>
+              <w:spacing w:after="100" w:before="100" w:line="240"/>
+              <w:ind w:left="100" w:right="100" w:firstLine="0" w:firstLineChars="0"/>
+              <w:rPr>
+                <w:rFonts w:ascii="Arial" w:hAnsi="Arial" w:eastAsia="Arial" w:cs="Arial"/>
+                <w:i w:val="false"/>
+                <w:b w:val="false"/>
+                <w:u w:val="none"/>
+                <w:strike w:val="false"/>
+                <w:sz w:val="22"/>
+                <w:szCs w:val="22"/>
+                <w:color w:val="000000"/>
+              </w:rPr>
+            </w:pPr>
+            <w:r>
+              <w:rPr>
+                <w:rFonts w:ascii="Arial" w:hAnsi="Arial" w:eastAsia="Arial" w:cs="Arial"/>
+                <w:i w:val="false"/>
+                <w:b w:val="false"/>
+                <w:u w:val="none"/>
+                <w:strike w:val="false"/>
+                <w:sz w:val="22"/>
+                <w:szCs w:val="22"/>
+                <w:color w:val="000000"/>
+              </w:rPr>
+              <w:t xml:space="preserve">-0.93 ± 0.18, P &lt; 0.001</w:t>
+            </w:r>
+          </w:p>
+        </w:tc>
+        <w:tc>
+          <w:tcPr>
+            <w:tcBorders>
+              <w:bottom w:val="none" w:sz="0" w:space="0" w:color="000000"/>
+              <w:top w:val="none" w:sz="0" w:space="0" w:color="000000"/>
+              <w:left w:val="none" w:sz="0" w:space="0" w:color="000000"/>
+              <w:right w:val="none" w:sz="0" w:space="0" w:color="000000"/>
+            </w:tcBorders>
+            <w:shd w:val="clear" w:color="auto" w:fill="FFFFFF"/>
+            <w:tcMar>
+              <w:top w:w="0" w:type="dxa"/>
+              <w:bottom w:w="0" w:type="dxa"/>
+              <w:left w:w="0" w:type="dxa"/>
+              <w:right w:w="0" w:type="dxa"/>
+            </w:tcMar>
+            <w:vAlign w:val="center"/>
+          </w:tcPr>
+          <w:p>
+            <w:pPr>
+              <w:jc w:val="left"/>
+              <w:pBdr>
+                <w:bottom w:val="none" w:sz="0" w:space="0" w:color="000000"/>
+                <w:top w:val="none" w:sz="0" w:space="0" w:color="000000"/>
+                <w:left w:val="none" w:sz="0" w:space="0" w:color="000000"/>
+                <w:right w:val="none" w:sz="0" w:space="0" w:color="000000"/>
+              </w:pBdr>
+              <w:spacing w:after="100" w:before="100" w:line="240"/>
+              <w:ind w:left="100" w:right="100" w:firstLine="0" w:firstLineChars="0"/>
+              <w:rPr>
+                <w:rFonts w:ascii="Arial" w:hAnsi="Arial" w:eastAsia="Arial" w:cs="Arial"/>
+                <w:i w:val="false"/>
+                <w:b w:val="false"/>
+                <w:u w:val="none"/>
+                <w:strike w:val="false"/>
+                <w:sz w:val="22"/>
+                <w:szCs w:val="22"/>
+                <w:color w:val="000000"/>
+              </w:rPr>
+            </w:pPr>
+            <w:r>
+              <w:rPr>
+                <w:rFonts w:ascii="Arial" w:hAnsi="Arial" w:eastAsia="Arial" w:cs="Arial"/>
+                <w:i w:val="false"/>
+                <w:b w:val="false"/>
+                <w:u w:val="none"/>
+                <w:strike w:val="false"/>
+                <w:sz w:val="22"/>
+                <w:szCs w:val="22"/>
+                <w:color w:val="000000"/>
+              </w:rPr>
+              <w:t xml:space="preserve">-0.83 ± 0.17, P &lt; 0.001</w:t>
             </w:r>
           </w:p>
         </w:tc>
@@ -2431,277 +2431,277 @@
                 <w:szCs w:val="22"/>
                 <w:color w:val="000000"/>
               </w:rPr>
-              <w:t xml:space="preserve">-0.44 ± 0.1, P &lt; 0.001</w:t>
-            </w:r>
-          </w:p>
-        </w:tc>
-        <w:tc>
-          <w:tcPr>
-            <w:tcBorders>
-              <w:bottom w:val="none" w:sz="0" w:space="0" w:color="000000"/>
-              <w:top w:val="none" w:sz="0" w:space="0" w:color="000000"/>
-              <w:left w:val="none" w:sz="0" w:space="0" w:color="000000"/>
-              <w:right w:val="none" w:sz="0" w:space="0" w:color="000000"/>
-            </w:tcBorders>
-            <w:shd w:val="clear" w:color="auto" w:fill="FFFFFF"/>
-            <w:tcMar>
-              <w:top w:w="0" w:type="dxa"/>
-              <w:bottom w:w="0" w:type="dxa"/>
-              <w:left w:w="0" w:type="dxa"/>
-              <w:right w:w="0" w:type="dxa"/>
-            </w:tcMar>
-            <w:vAlign w:val="center"/>
-          </w:tcPr>
-          <w:p>
-            <w:pPr>
-              <w:jc w:val="left"/>
-              <w:pBdr>
-                <w:bottom w:val="none" w:sz="0" w:space="0" w:color="000000"/>
-                <w:top w:val="none" w:sz="0" w:space="0" w:color="000000"/>
-                <w:left w:val="none" w:sz="0" w:space="0" w:color="000000"/>
-                <w:right w:val="none" w:sz="0" w:space="0" w:color="000000"/>
-              </w:pBdr>
-              <w:spacing w:after="100" w:before="100" w:line="240"/>
-              <w:ind w:left="100" w:right="100" w:firstLine="0" w:firstLineChars="0"/>
-              <w:rPr>
-                <w:rFonts w:ascii="Arial" w:hAnsi="Arial" w:eastAsia="Arial" w:cs="Arial"/>
-                <w:i w:val="false"/>
-                <w:b w:val="false"/>
-                <w:u w:val="none"/>
-                <w:strike w:val="false"/>
-                <w:sz w:val="22"/>
-                <w:szCs w:val="22"/>
-                <w:color w:val="000000"/>
-              </w:rPr>
-            </w:pPr>
-            <w:r>
-              <w:rPr>
-                <w:rFonts w:ascii="Arial" w:hAnsi="Arial" w:eastAsia="Arial" w:cs="Arial"/>
-                <w:i w:val="false"/>
-                <w:b w:val="false"/>
-                <w:u w:val="none"/>
-                <w:strike w:val="false"/>
-                <w:sz w:val="22"/>
-                <w:szCs w:val="22"/>
-                <w:color w:val="000000"/>
-              </w:rPr>
-              <w:t xml:space="preserve">-0.45 ± 0.1, P &lt; 0.001</w:t>
-            </w:r>
-          </w:p>
-        </w:tc>
-        <w:tc>
-          <w:tcPr>
-            <w:tcBorders>
-              <w:bottom w:val="none" w:sz="0" w:space="0" w:color="000000"/>
-              <w:top w:val="none" w:sz="0" w:space="0" w:color="000000"/>
-              <w:left w:val="none" w:sz="0" w:space="0" w:color="000000"/>
-              <w:right w:val="none" w:sz="0" w:space="0" w:color="000000"/>
-            </w:tcBorders>
-            <w:shd w:val="clear" w:color="auto" w:fill="FFFFFF"/>
-            <w:tcMar>
-              <w:top w:w="0" w:type="dxa"/>
-              <w:bottom w:w="0" w:type="dxa"/>
-              <w:left w:w="0" w:type="dxa"/>
-              <w:right w:w="0" w:type="dxa"/>
-            </w:tcMar>
-            <w:vAlign w:val="center"/>
-          </w:tcPr>
-          <w:p>
-            <w:pPr>
-              <w:jc w:val="left"/>
-              <w:pBdr>
-                <w:bottom w:val="none" w:sz="0" w:space="0" w:color="000000"/>
-                <w:top w:val="none" w:sz="0" w:space="0" w:color="000000"/>
-                <w:left w:val="none" w:sz="0" w:space="0" w:color="000000"/>
-                <w:right w:val="none" w:sz="0" w:space="0" w:color="000000"/>
-              </w:pBdr>
-              <w:spacing w:after="100" w:before="100" w:line="240"/>
-              <w:ind w:left="100" w:right="100" w:firstLine="0" w:firstLineChars="0"/>
-              <w:rPr>
-                <w:rFonts w:ascii="Arial" w:hAnsi="Arial" w:eastAsia="Arial" w:cs="Arial"/>
-                <w:i w:val="false"/>
-                <w:b w:val="false"/>
-                <w:u w:val="none"/>
-                <w:strike w:val="false"/>
-                <w:sz w:val="22"/>
-                <w:szCs w:val="22"/>
-                <w:color w:val="000000"/>
-              </w:rPr>
-            </w:pPr>
-            <w:r>
-              <w:rPr>
-                <w:rFonts w:ascii="Arial" w:hAnsi="Arial" w:eastAsia="Arial" w:cs="Arial"/>
-                <w:i w:val="false"/>
-                <w:b w:val="false"/>
-                <w:u w:val="none"/>
-                <w:strike w:val="false"/>
-                <w:sz w:val="22"/>
-                <w:szCs w:val="22"/>
-                <w:color w:val="000000"/>
-              </w:rPr>
-              <w:t xml:space="preserve">-0.61 ± 0.11, P &lt; 0.001</w:t>
-            </w:r>
-          </w:p>
-        </w:tc>
-        <w:tc>
-          <w:tcPr>
-            <w:tcBorders>
-              <w:bottom w:val="none" w:sz="0" w:space="0" w:color="000000"/>
-              <w:top w:val="none" w:sz="0" w:space="0" w:color="000000"/>
-              <w:left w:val="none" w:sz="0" w:space="0" w:color="000000"/>
-              <w:right w:val="none" w:sz="0" w:space="0" w:color="000000"/>
-            </w:tcBorders>
-            <w:shd w:val="clear" w:color="auto" w:fill="FFFFFF"/>
-            <w:tcMar>
-              <w:top w:w="0" w:type="dxa"/>
-              <w:bottom w:w="0" w:type="dxa"/>
-              <w:left w:w="0" w:type="dxa"/>
-              <w:right w:w="0" w:type="dxa"/>
-            </w:tcMar>
-            <w:vAlign w:val="center"/>
-          </w:tcPr>
-          <w:p>
-            <w:pPr>
-              <w:jc w:val="left"/>
-              <w:pBdr>
-                <w:bottom w:val="none" w:sz="0" w:space="0" w:color="000000"/>
-                <w:top w:val="none" w:sz="0" w:space="0" w:color="000000"/>
-                <w:left w:val="none" w:sz="0" w:space="0" w:color="000000"/>
-                <w:right w:val="none" w:sz="0" w:space="0" w:color="000000"/>
-              </w:pBdr>
-              <w:spacing w:after="100" w:before="100" w:line="240"/>
-              <w:ind w:left="100" w:right="100" w:firstLine="0" w:firstLineChars="0"/>
-              <w:rPr>
-                <w:rFonts w:ascii="Arial" w:hAnsi="Arial" w:eastAsia="Arial" w:cs="Arial"/>
-                <w:i w:val="false"/>
-                <w:b w:val="false"/>
-                <w:u w:val="none"/>
-                <w:strike w:val="false"/>
-                <w:sz w:val="22"/>
-                <w:szCs w:val="22"/>
-                <w:color w:val="000000"/>
-              </w:rPr>
-            </w:pPr>
-            <w:r>
-              <w:rPr>
-                <w:rFonts w:ascii="Arial" w:hAnsi="Arial" w:eastAsia="Arial" w:cs="Arial"/>
-                <w:i w:val="false"/>
-                <w:b w:val="false"/>
-                <w:u w:val="none"/>
-                <w:strike w:val="false"/>
-                <w:sz w:val="22"/>
-                <w:szCs w:val="22"/>
-                <w:color w:val="000000"/>
-              </w:rPr>
-              <w:t xml:space="preserve">-0.64 ± 0.12, P &lt; 0.001</w:t>
-            </w:r>
-          </w:p>
-        </w:tc>
-        <w:tc>
-          <w:tcPr>
-            <w:tcBorders>
-              <w:bottom w:val="none" w:sz="0" w:space="0" w:color="000000"/>
-              <w:top w:val="none" w:sz="0" w:space="0" w:color="000000"/>
-              <w:left w:val="none" w:sz="0" w:space="0" w:color="000000"/>
-              <w:right w:val="none" w:sz="0" w:space="0" w:color="000000"/>
-            </w:tcBorders>
-            <w:shd w:val="clear" w:color="auto" w:fill="FFFFFF"/>
-            <w:tcMar>
-              <w:top w:w="0" w:type="dxa"/>
-              <w:bottom w:w="0" w:type="dxa"/>
-              <w:left w:w="0" w:type="dxa"/>
-              <w:right w:w="0" w:type="dxa"/>
-            </w:tcMar>
-            <w:vAlign w:val="center"/>
-          </w:tcPr>
-          <w:p>
-            <w:pPr>
-              <w:jc w:val="left"/>
-              <w:pBdr>
-                <w:bottom w:val="none" w:sz="0" w:space="0" w:color="000000"/>
-                <w:top w:val="none" w:sz="0" w:space="0" w:color="000000"/>
-                <w:left w:val="none" w:sz="0" w:space="0" w:color="000000"/>
-                <w:right w:val="none" w:sz="0" w:space="0" w:color="000000"/>
-              </w:pBdr>
-              <w:spacing w:after="100" w:before="100" w:line="240"/>
-              <w:ind w:left="100" w:right="100" w:firstLine="0" w:firstLineChars="0"/>
-              <w:rPr>
-                <w:rFonts w:ascii="Arial" w:hAnsi="Arial" w:eastAsia="Arial" w:cs="Arial"/>
-                <w:i w:val="false"/>
-                <w:b w:val="false"/>
-                <w:u w:val="none"/>
-                <w:strike w:val="false"/>
-                <w:sz w:val="22"/>
-                <w:szCs w:val="22"/>
-                <w:color w:val="000000"/>
-              </w:rPr>
-            </w:pPr>
-            <w:r>
-              <w:rPr>
-                <w:rFonts w:ascii="Arial" w:hAnsi="Arial" w:eastAsia="Arial" w:cs="Arial"/>
-                <w:i w:val="false"/>
-                <w:b w:val="false"/>
-                <w:u w:val="none"/>
-                <w:strike w:val="false"/>
-                <w:sz w:val="22"/>
-                <w:szCs w:val="22"/>
-                <w:color w:val="000000"/>
-              </w:rPr>
-              <w:t xml:space="preserve">-0.11 ± 0.22, P = 0.614</w:t>
-            </w:r>
-          </w:p>
-        </w:tc>
-        <w:tc>
-          <w:tcPr>
-            <w:tcBorders>
-              <w:bottom w:val="none" w:sz="0" w:space="0" w:color="000000"/>
-              <w:top w:val="none" w:sz="0" w:space="0" w:color="000000"/>
-              <w:left w:val="none" w:sz="0" w:space="0" w:color="000000"/>
-              <w:right w:val="none" w:sz="0" w:space="0" w:color="000000"/>
-            </w:tcBorders>
-            <w:shd w:val="clear" w:color="auto" w:fill="FFFFFF"/>
-            <w:tcMar>
-              <w:top w:w="0" w:type="dxa"/>
-              <w:bottom w:w="0" w:type="dxa"/>
-              <w:left w:w="0" w:type="dxa"/>
-              <w:right w:w="0" w:type="dxa"/>
-            </w:tcMar>
-            <w:vAlign w:val="center"/>
-          </w:tcPr>
-          <w:p>
-            <w:pPr>
-              <w:jc w:val="left"/>
-              <w:pBdr>
-                <w:bottom w:val="none" w:sz="0" w:space="0" w:color="000000"/>
-                <w:top w:val="none" w:sz="0" w:space="0" w:color="000000"/>
-                <w:left w:val="none" w:sz="0" w:space="0" w:color="000000"/>
-                <w:right w:val="none" w:sz="0" w:space="0" w:color="000000"/>
-              </w:pBdr>
-              <w:spacing w:after="100" w:before="100" w:line="240"/>
-              <w:ind w:left="100" w:right="100" w:firstLine="0" w:firstLineChars="0"/>
-              <w:rPr>
-                <w:rFonts w:ascii="Arial" w:hAnsi="Arial" w:eastAsia="Arial" w:cs="Arial"/>
-                <w:i w:val="false"/>
-                <w:b w:val="false"/>
-                <w:u w:val="none"/>
-                <w:strike w:val="false"/>
-                <w:sz w:val="22"/>
-                <w:szCs w:val="22"/>
-                <w:color w:val="000000"/>
-              </w:rPr>
-            </w:pPr>
-            <w:r>
-              <w:rPr>
-                <w:rFonts w:ascii="Arial" w:hAnsi="Arial" w:eastAsia="Arial" w:cs="Arial"/>
-                <w:i w:val="false"/>
-                <w:b w:val="false"/>
-                <w:u w:val="none"/>
-                <w:strike w:val="false"/>
-                <w:sz w:val="22"/>
-                <w:szCs w:val="22"/>
-                <w:color w:val="000000"/>
-              </w:rPr>
-              <w:t xml:space="preserve">-0.14 ± 0.2, P = 0.485</w:t>
+              <w:t xml:space="preserve">-0.53 ± 0.11, P &lt; 0.001</w:t>
+            </w:r>
+          </w:p>
+        </w:tc>
+        <w:tc>
+          <w:tcPr>
+            <w:tcBorders>
+              <w:bottom w:val="none" w:sz="0" w:space="0" w:color="000000"/>
+              <w:top w:val="none" w:sz="0" w:space="0" w:color="000000"/>
+              <w:left w:val="none" w:sz="0" w:space="0" w:color="000000"/>
+              <w:right w:val="none" w:sz="0" w:space="0" w:color="000000"/>
+            </w:tcBorders>
+            <w:shd w:val="clear" w:color="auto" w:fill="FFFFFF"/>
+            <w:tcMar>
+              <w:top w:w="0" w:type="dxa"/>
+              <w:bottom w:w="0" w:type="dxa"/>
+              <w:left w:w="0" w:type="dxa"/>
+              <w:right w:w="0" w:type="dxa"/>
+            </w:tcMar>
+            <w:vAlign w:val="center"/>
+          </w:tcPr>
+          <w:p>
+            <w:pPr>
+              <w:jc w:val="left"/>
+              <w:pBdr>
+                <w:bottom w:val="none" w:sz="0" w:space="0" w:color="000000"/>
+                <w:top w:val="none" w:sz="0" w:space="0" w:color="000000"/>
+                <w:left w:val="none" w:sz="0" w:space="0" w:color="000000"/>
+                <w:right w:val="none" w:sz="0" w:space="0" w:color="000000"/>
+              </w:pBdr>
+              <w:spacing w:after="100" w:before="100" w:line="240"/>
+              <w:ind w:left="100" w:right="100" w:firstLine="0" w:firstLineChars="0"/>
+              <w:rPr>
+                <w:rFonts w:ascii="Arial" w:hAnsi="Arial" w:eastAsia="Arial" w:cs="Arial"/>
+                <w:i w:val="false"/>
+                <w:b w:val="false"/>
+                <w:u w:val="none"/>
+                <w:strike w:val="false"/>
+                <w:sz w:val="22"/>
+                <w:szCs w:val="22"/>
+                <w:color w:val="000000"/>
+              </w:rPr>
+            </w:pPr>
+            <w:r>
+              <w:rPr>
+                <w:rFonts w:ascii="Arial" w:hAnsi="Arial" w:eastAsia="Arial" w:cs="Arial"/>
+                <w:i w:val="false"/>
+                <w:b w:val="false"/>
+                <w:u w:val="none"/>
+                <w:strike w:val="false"/>
+                <w:sz w:val="22"/>
+                <w:szCs w:val="22"/>
+                <w:color w:val="000000"/>
+              </w:rPr>
+              <w:t xml:space="preserve">-0.53 ± 0.11, P &lt; 0.001</w:t>
+            </w:r>
+          </w:p>
+        </w:tc>
+        <w:tc>
+          <w:tcPr>
+            <w:tcBorders>
+              <w:bottom w:val="none" w:sz="0" w:space="0" w:color="000000"/>
+              <w:top w:val="none" w:sz="0" w:space="0" w:color="000000"/>
+              <w:left w:val="none" w:sz="0" w:space="0" w:color="000000"/>
+              <w:right w:val="none" w:sz="0" w:space="0" w:color="000000"/>
+            </w:tcBorders>
+            <w:shd w:val="clear" w:color="auto" w:fill="FFFFFF"/>
+            <w:tcMar>
+              <w:top w:w="0" w:type="dxa"/>
+              <w:bottom w:w="0" w:type="dxa"/>
+              <w:left w:w="0" w:type="dxa"/>
+              <w:right w:w="0" w:type="dxa"/>
+            </w:tcMar>
+            <w:vAlign w:val="center"/>
+          </w:tcPr>
+          <w:p>
+            <w:pPr>
+              <w:jc w:val="left"/>
+              <w:pBdr>
+                <w:bottom w:val="none" w:sz="0" w:space="0" w:color="000000"/>
+                <w:top w:val="none" w:sz="0" w:space="0" w:color="000000"/>
+                <w:left w:val="none" w:sz="0" w:space="0" w:color="000000"/>
+                <w:right w:val="none" w:sz="0" w:space="0" w:color="000000"/>
+              </w:pBdr>
+              <w:spacing w:after="100" w:before="100" w:line="240"/>
+              <w:ind w:left="100" w:right="100" w:firstLine="0" w:firstLineChars="0"/>
+              <w:rPr>
+                <w:rFonts w:ascii="Arial" w:hAnsi="Arial" w:eastAsia="Arial" w:cs="Arial"/>
+                <w:i w:val="false"/>
+                <w:b w:val="false"/>
+                <w:u w:val="none"/>
+                <w:strike w:val="false"/>
+                <w:sz w:val="22"/>
+                <w:szCs w:val="22"/>
+                <w:color w:val="000000"/>
+              </w:rPr>
+            </w:pPr>
+            <w:r>
+              <w:rPr>
+                <w:rFonts w:ascii="Arial" w:hAnsi="Arial" w:eastAsia="Arial" w:cs="Arial"/>
+                <w:i w:val="false"/>
+                <w:b w:val="false"/>
+                <w:u w:val="none"/>
+                <w:strike w:val="false"/>
+                <w:sz w:val="22"/>
+                <w:szCs w:val="22"/>
+                <w:color w:val="000000"/>
+              </w:rPr>
+              <w:t xml:space="preserve">-0.54 ± 0.09, P &lt; 0.001</w:t>
+            </w:r>
+          </w:p>
+        </w:tc>
+        <w:tc>
+          <w:tcPr>
+            <w:tcBorders>
+              <w:bottom w:val="none" w:sz="0" w:space="0" w:color="000000"/>
+              <w:top w:val="none" w:sz="0" w:space="0" w:color="000000"/>
+              <w:left w:val="none" w:sz="0" w:space="0" w:color="000000"/>
+              <w:right w:val="none" w:sz="0" w:space="0" w:color="000000"/>
+            </w:tcBorders>
+            <w:shd w:val="clear" w:color="auto" w:fill="FFFFFF"/>
+            <w:tcMar>
+              <w:top w:w="0" w:type="dxa"/>
+              <w:bottom w:w="0" w:type="dxa"/>
+              <w:left w:w="0" w:type="dxa"/>
+              <w:right w:w="0" w:type="dxa"/>
+            </w:tcMar>
+            <w:vAlign w:val="center"/>
+          </w:tcPr>
+          <w:p>
+            <w:pPr>
+              <w:jc w:val="left"/>
+              <w:pBdr>
+                <w:bottom w:val="none" w:sz="0" w:space="0" w:color="000000"/>
+                <w:top w:val="none" w:sz="0" w:space="0" w:color="000000"/>
+                <w:left w:val="none" w:sz="0" w:space="0" w:color="000000"/>
+                <w:right w:val="none" w:sz="0" w:space="0" w:color="000000"/>
+              </w:pBdr>
+              <w:spacing w:after="100" w:before="100" w:line="240"/>
+              <w:ind w:left="100" w:right="100" w:firstLine="0" w:firstLineChars="0"/>
+              <w:rPr>
+                <w:rFonts w:ascii="Arial" w:hAnsi="Arial" w:eastAsia="Arial" w:cs="Arial"/>
+                <w:i w:val="false"/>
+                <w:b w:val="false"/>
+                <w:u w:val="none"/>
+                <w:strike w:val="false"/>
+                <w:sz w:val="22"/>
+                <w:szCs w:val="22"/>
+                <w:color w:val="000000"/>
+              </w:rPr>
+            </w:pPr>
+            <w:r>
+              <w:rPr>
+                <w:rFonts w:ascii="Arial" w:hAnsi="Arial" w:eastAsia="Arial" w:cs="Arial"/>
+                <w:i w:val="false"/>
+                <w:b w:val="false"/>
+                <w:u w:val="none"/>
+                <w:strike w:val="false"/>
+                <w:sz w:val="22"/>
+                <w:szCs w:val="22"/>
+                <w:color w:val="000000"/>
+              </w:rPr>
+              <w:t xml:space="preserve">-0.55 ± 0.09, P &lt; 0.001</w:t>
+            </w:r>
+          </w:p>
+        </w:tc>
+        <w:tc>
+          <w:tcPr>
+            <w:tcBorders>
+              <w:bottom w:val="none" w:sz="0" w:space="0" w:color="000000"/>
+              <w:top w:val="none" w:sz="0" w:space="0" w:color="000000"/>
+              <w:left w:val="none" w:sz="0" w:space="0" w:color="000000"/>
+              <w:right w:val="none" w:sz="0" w:space="0" w:color="000000"/>
+            </w:tcBorders>
+            <w:shd w:val="clear" w:color="auto" w:fill="FFFFFF"/>
+            <w:tcMar>
+              <w:top w:w="0" w:type="dxa"/>
+              <w:bottom w:w="0" w:type="dxa"/>
+              <w:left w:w="0" w:type="dxa"/>
+              <w:right w:w="0" w:type="dxa"/>
+            </w:tcMar>
+            <w:vAlign w:val="center"/>
+          </w:tcPr>
+          <w:p>
+            <w:pPr>
+              <w:jc w:val="left"/>
+              <w:pBdr>
+                <w:bottom w:val="none" w:sz="0" w:space="0" w:color="000000"/>
+                <w:top w:val="none" w:sz="0" w:space="0" w:color="000000"/>
+                <w:left w:val="none" w:sz="0" w:space="0" w:color="000000"/>
+                <w:right w:val="none" w:sz="0" w:space="0" w:color="000000"/>
+              </w:pBdr>
+              <w:spacing w:after="100" w:before="100" w:line="240"/>
+              <w:ind w:left="100" w:right="100" w:firstLine="0" w:firstLineChars="0"/>
+              <w:rPr>
+                <w:rFonts w:ascii="Arial" w:hAnsi="Arial" w:eastAsia="Arial" w:cs="Arial"/>
+                <w:i w:val="false"/>
+                <w:b w:val="false"/>
+                <w:u w:val="none"/>
+                <w:strike w:val="false"/>
+                <w:sz w:val="22"/>
+                <w:szCs w:val="22"/>
+                <w:color w:val="000000"/>
+              </w:rPr>
+            </w:pPr>
+            <w:r>
+              <w:rPr>
+                <w:rFonts w:ascii="Arial" w:hAnsi="Arial" w:eastAsia="Arial" w:cs="Arial"/>
+                <w:i w:val="false"/>
+                <w:b w:val="false"/>
+                <w:u w:val="none"/>
+                <w:strike w:val="false"/>
+                <w:sz w:val="22"/>
+                <w:szCs w:val="22"/>
+                <w:color w:val="000000"/>
+              </w:rPr>
+              <w:t xml:space="preserve">-0.76 ± 0.19, P &lt; 0.001</w:t>
+            </w:r>
+          </w:p>
+        </w:tc>
+        <w:tc>
+          <w:tcPr>
+            <w:tcBorders>
+              <w:bottom w:val="none" w:sz="0" w:space="0" w:color="000000"/>
+              <w:top w:val="none" w:sz="0" w:space="0" w:color="000000"/>
+              <w:left w:val="none" w:sz="0" w:space="0" w:color="000000"/>
+              <w:right w:val="none" w:sz="0" w:space="0" w:color="000000"/>
+            </w:tcBorders>
+            <w:shd w:val="clear" w:color="auto" w:fill="FFFFFF"/>
+            <w:tcMar>
+              <w:top w:w="0" w:type="dxa"/>
+              <w:bottom w:w="0" w:type="dxa"/>
+              <w:left w:w="0" w:type="dxa"/>
+              <w:right w:w="0" w:type="dxa"/>
+            </w:tcMar>
+            <w:vAlign w:val="center"/>
+          </w:tcPr>
+          <w:p>
+            <w:pPr>
+              <w:jc w:val="left"/>
+              <w:pBdr>
+                <w:bottom w:val="none" w:sz="0" w:space="0" w:color="000000"/>
+                <w:top w:val="none" w:sz="0" w:space="0" w:color="000000"/>
+                <w:left w:val="none" w:sz="0" w:space="0" w:color="000000"/>
+                <w:right w:val="none" w:sz="0" w:space="0" w:color="000000"/>
+              </w:pBdr>
+              <w:spacing w:after="100" w:before="100" w:line="240"/>
+              <w:ind w:left="100" w:right="100" w:firstLine="0" w:firstLineChars="0"/>
+              <w:rPr>
+                <w:rFonts w:ascii="Arial" w:hAnsi="Arial" w:eastAsia="Arial" w:cs="Arial"/>
+                <w:i w:val="false"/>
+                <w:b w:val="false"/>
+                <w:u w:val="none"/>
+                <w:strike w:val="false"/>
+                <w:sz w:val="22"/>
+                <w:szCs w:val="22"/>
+                <w:color w:val="000000"/>
+              </w:rPr>
+            </w:pPr>
+            <w:r>
+              <w:rPr>
+                <w:rFonts w:ascii="Arial" w:hAnsi="Arial" w:eastAsia="Arial" w:cs="Arial"/>
+                <w:i w:val="false"/>
+                <w:b w:val="false"/>
+                <w:u w:val="none"/>
+                <w:strike w:val="false"/>
+                <w:sz w:val="22"/>
+                <w:szCs w:val="22"/>
+                <w:color w:val="000000"/>
+              </w:rPr>
+              <w:t xml:space="preserve">-0.77 ± 0.19, P &lt; 0.001</w:t>
             </w:r>
           </w:p>
         </w:tc>
@@ -2815,277 +2815,277 @@
                 <w:szCs w:val="22"/>
                 <w:color w:val="000000"/>
               </w:rPr>
-              <w:t xml:space="preserve">0.1 ± 0.06, P = 0.092</w:t>
-            </w:r>
-          </w:p>
-        </w:tc>
-        <w:tc>
-          <w:tcPr>
-            <w:tcBorders>
-              <w:bottom w:val="none" w:sz="0" w:space="0" w:color="000000"/>
-              <w:top w:val="none" w:sz="0" w:space="0" w:color="000000"/>
-              <w:left w:val="none" w:sz="0" w:space="0" w:color="000000"/>
-              <w:right w:val="none" w:sz="0" w:space="0" w:color="000000"/>
-            </w:tcBorders>
-            <w:shd w:val="clear" w:color="auto" w:fill="FFFFFF"/>
-            <w:tcMar>
-              <w:top w:w="0" w:type="dxa"/>
-              <w:bottom w:w="0" w:type="dxa"/>
-              <w:left w:w="0" w:type="dxa"/>
-              <w:right w:w="0" w:type="dxa"/>
-            </w:tcMar>
-            <w:vAlign w:val="center"/>
-          </w:tcPr>
-          <w:p>
-            <w:pPr>
-              <w:jc w:val="left"/>
-              <w:pBdr>
-                <w:bottom w:val="none" w:sz="0" w:space="0" w:color="000000"/>
-                <w:top w:val="none" w:sz="0" w:space="0" w:color="000000"/>
-                <w:left w:val="none" w:sz="0" w:space="0" w:color="000000"/>
-                <w:right w:val="none" w:sz="0" w:space="0" w:color="000000"/>
-              </w:pBdr>
-              <w:spacing w:after="100" w:before="100" w:line="240"/>
-              <w:ind w:left="100" w:right="100" w:firstLine="0" w:firstLineChars="0"/>
-              <w:rPr>
-                <w:rFonts w:ascii="Arial" w:hAnsi="Arial" w:eastAsia="Arial" w:cs="Arial"/>
-                <w:i w:val="false"/>
-                <w:b w:val="false"/>
-                <w:u w:val="none"/>
-                <w:strike w:val="false"/>
-                <w:sz w:val="22"/>
-                <w:szCs w:val="22"/>
-                <w:color w:val="000000"/>
-              </w:rPr>
-            </w:pPr>
-            <w:r>
-              <w:rPr>
-                <w:rFonts w:ascii="Arial" w:hAnsi="Arial" w:eastAsia="Arial" w:cs="Arial"/>
-                <w:i w:val="false"/>
-                <w:b w:val="false"/>
-                <w:u w:val="none"/>
-                <w:strike w:val="false"/>
-                <w:sz w:val="22"/>
-                <w:szCs w:val="22"/>
-                <w:color w:val="000000"/>
-              </w:rPr>
-              <w:t xml:space="preserve">0.08 ± 0.06, P = 0.182</w:t>
-            </w:r>
-          </w:p>
-        </w:tc>
-        <w:tc>
-          <w:tcPr>
-            <w:tcBorders>
-              <w:bottom w:val="none" w:sz="0" w:space="0" w:color="000000"/>
-              <w:top w:val="none" w:sz="0" w:space="0" w:color="000000"/>
-              <w:left w:val="none" w:sz="0" w:space="0" w:color="000000"/>
-              <w:right w:val="none" w:sz="0" w:space="0" w:color="000000"/>
-            </w:tcBorders>
-            <w:shd w:val="clear" w:color="auto" w:fill="FFFFFF"/>
-            <w:tcMar>
-              <w:top w:w="0" w:type="dxa"/>
-              <w:bottom w:w="0" w:type="dxa"/>
-              <w:left w:w="0" w:type="dxa"/>
-              <w:right w:w="0" w:type="dxa"/>
-            </w:tcMar>
-            <w:vAlign w:val="center"/>
-          </w:tcPr>
-          <w:p>
-            <w:pPr>
-              <w:jc w:val="left"/>
-              <w:pBdr>
-                <w:bottom w:val="none" w:sz="0" w:space="0" w:color="000000"/>
-                <w:top w:val="none" w:sz="0" w:space="0" w:color="000000"/>
-                <w:left w:val="none" w:sz="0" w:space="0" w:color="000000"/>
-                <w:right w:val="none" w:sz="0" w:space="0" w:color="000000"/>
-              </w:pBdr>
-              <w:spacing w:after="100" w:before="100" w:line="240"/>
-              <w:ind w:left="100" w:right="100" w:firstLine="0" w:firstLineChars="0"/>
-              <w:rPr>
-                <w:rFonts w:ascii="Arial" w:hAnsi="Arial" w:eastAsia="Arial" w:cs="Arial"/>
-                <w:i w:val="false"/>
-                <w:b w:val="false"/>
-                <w:u w:val="none"/>
-                <w:strike w:val="false"/>
-                <w:sz w:val="22"/>
-                <w:szCs w:val="22"/>
-                <w:color w:val="000000"/>
-              </w:rPr>
-            </w:pPr>
-            <w:r>
-              <w:rPr>
-                <w:rFonts w:ascii="Arial" w:hAnsi="Arial" w:eastAsia="Arial" w:cs="Arial"/>
-                <w:i w:val="false"/>
-                <w:b w:val="false"/>
-                <w:u w:val="none"/>
-                <w:strike w:val="false"/>
-                <w:sz w:val="22"/>
-                <w:szCs w:val="22"/>
-                <w:color w:val="000000"/>
-              </w:rPr>
-              <w:t xml:space="preserve">0.17 ± 0.06, P &lt; 0.01</w:t>
-            </w:r>
-          </w:p>
-        </w:tc>
-        <w:tc>
-          <w:tcPr>
-            <w:tcBorders>
-              <w:bottom w:val="none" w:sz="0" w:space="0" w:color="000000"/>
-              <w:top w:val="none" w:sz="0" w:space="0" w:color="000000"/>
-              <w:left w:val="none" w:sz="0" w:space="0" w:color="000000"/>
-              <w:right w:val="none" w:sz="0" w:space="0" w:color="000000"/>
-            </w:tcBorders>
-            <w:shd w:val="clear" w:color="auto" w:fill="FFFFFF"/>
-            <w:tcMar>
-              <w:top w:w="0" w:type="dxa"/>
-              <w:bottom w:w="0" w:type="dxa"/>
-              <w:left w:w="0" w:type="dxa"/>
-              <w:right w:w="0" w:type="dxa"/>
-            </w:tcMar>
-            <w:vAlign w:val="center"/>
-          </w:tcPr>
-          <w:p>
-            <w:pPr>
-              <w:jc w:val="left"/>
-              <w:pBdr>
-                <w:bottom w:val="none" w:sz="0" w:space="0" w:color="000000"/>
-                <w:top w:val="none" w:sz="0" w:space="0" w:color="000000"/>
-                <w:left w:val="none" w:sz="0" w:space="0" w:color="000000"/>
-                <w:right w:val="none" w:sz="0" w:space="0" w:color="000000"/>
-              </w:pBdr>
-              <w:spacing w:after="100" w:before="100" w:line="240"/>
-              <w:ind w:left="100" w:right="100" w:firstLine="0" w:firstLineChars="0"/>
-              <w:rPr>
-                <w:rFonts w:ascii="Arial" w:hAnsi="Arial" w:eastAsia="Arial" w:cs="Arial"/>
-                <w:i w:val="false"/>
-                <w:b w:val="false"/>
-                <w:u w:val="none"/>
-                <w:strike w:val="false"/>
-                <w:sz w:val="22"/>
-                <w:szCs w:val="22"/>
-                <w:color w:val="000000"/>
-              </w:rPr>
-            </w:pPr>
-            <w:r>
-              <w:rPr>
-                <w:rFonts w:ascii="Arial" w:hAnsi="Arial" w:eastAsia="Arial" w:cs="Arial"/>
-                <w:i w:val="false"/>
-                <w:b w:val="false"/>
-                <w:u w:val="none"/>
-                <w:strike w:val="false"/>
-                <w:sz w:val="22"/>
-                <w:szCs w:val="22"/>
-                <w:color w:val="000000"/>
-              </w:rPr>
-              <w:t xml:space="preserve">0.2 ± 0.06, P &lt; 0.001</w:t>
-            </w:r>
-          </w:p>
-        </w:tc>
-        <w:tc>
-          <w:tcPr>
-            <w:tcBorders>
-              <w:bottom w:val="none" w:sz="0" w:space="0" w:color="000000"/>
-              <w:top w:val="none" w:sz="0" w:space="0" w:color="000000"/>
-              <w:left w:val="none" w:sz="0" w:space="0" w:color="000000"/>
-              <w:right w:val="none" w:sz="0" w:space="0" w:color="000000"/>
-            </w:tcBorders>
-            <w:shd w:val="clear" w:color="auto" w:fill="FFFFFF"/>
-            <w:tcMar>
-              <w:top w:w="0" w:type="dxa"/>
-              <w:bottom w:w="0" w:type="dxa"/>
-              <w:left w:w="0" w:type="dxa"/>
-              <w:right w:w="0" w:type="dxa"/>
-            </w:tcMar>
-            <w:vAlign w:val="center"/>
-          </w:tcPr>
-          <w:p>
-            <w:pPr>
-              <w:jc w:val="left"/>
-              <w:pBdr>
-                <w:bottom w:val="none" w:sz="0" w:space="0" w:color="000000"/>
-                <w:top w:val="none" w:sz="0" w:space="0" w:color="000000"/>
-                <w:left w:val="none" w:sz="0" w:space="0" w:color="000000"/>
-                <w:right w:val="none" w:sz="0" w:space="0" w:color="000000"/>
-              </w:pBdr>
-              <w:spacing w:after="100" w:before="100" w:line="240"/>
-              <w:ind w:left="100" w:right="100" w:firstLine="0" w:firstLineChars="0"/>
-              <w:rPr>
-                <w:rFonts w:ascii="Arial" w:hAnsi="Arial" w:eastAsia="Arial" w:cs="Arial"/>
-                <w:i w:val="false"/>
-                <w:b w:val="false"/>
-                <w:u w:val="none"/>
-                <w:strike w:val="false"/>
-                <w:sz w:val="22"/>
-                <w:szCs w:val="22"/>
-                <w:color w:val="000000"/>
-              </w:rPr>
-            </w:pPr>
-            <w:r>
-              <w:rPr>
-                <w:rFonts w:ascii="Arial" w:hAnsi="Arial" w:eastAsia="Arial" w:cs="Arial"/>
-                <w:i w:val="false"/>
-                <w:b w:val="false"/>
-                <w:u w:val="none"/>
-                <w:strike w:val="false"/>
-                <w:sz w:val="22"/>
-                <w:szCs w:val="22"/>
-                <w:color w:val="000000"/>
-              </w:rPr>
-              <w:t xml:space="preserve">-0.07 ± 0.08, P = 0.37</w:t>
-            </w:r>
-          </w:p>
-        </w:tc>
-        <w:tc>
-          <w:tcPr>
-            <w:tcBorders>
-              <w:bottom w:val="none" w:sz="0" w:space="0" w:color="000000"/>
-              <w:top w:val="none" w:sz="0" w:space="0" w:color="000000"/>
-              <w:left w:val="none" w:sz="0" w:space="0" w:color="000000"/>
-              <w:right w:val="none" w:sz="0" w:space="0" w:color="000000"/>
-            </w:tcBorders>
-            <w:shd w:val="clear" w:color="auto" w:fill="FFFFFF"/>
-            <w:tcMar>
-              <w:top w:w="0" w:type="dxa"/>
-              <w:bottom w:w="0" w:type="dxa"/>
-              <w:left w:w="0" w:type="dxa"/>
-              <w:right w:w="0" w:type="dxa"/>
-            </w:tcMar>
-            <w:vAlign w:val="center"/>
-          </w:tcPr>
-          <w:p>
-            <w:pPr>
-              <w:jc w:val="left"/>
-              <w:pBdr>
-                <w:bottom w:val="none" w:sz="0" w:space="0" w:color="000000"/>
-                <w:top w:val="none" w:sz="0" w:space="0" w:color="000000"/>
-                <w:left w:val="none" w:sz="0" w:space="0" w:color="000000"/>
-                <w:right w:val="none" w:sz="0" w:space="0" w:color="000000"/>
-              </w:pBdr>
-              <w:spacing w:after="100" w:before="100" w:line="240"/>
-              <w:ind w:left="100" w:right="100" w:firstLine="0" w:firstLineChars="0"/>
-              <w:rPr>
-                <w:rFonts w:ascii="Arial" w:hAnsi="Arial" w:eastAsia="Arial" w:cs="Arial"/>
-                <w:i w:val="false"/>
-                <w:b w:val="false"/>
-                <w:u w:val="none"/>
-                <w:strike w:val="false"/>
-                <w:sz w:val="22"/>
-                <w:szCs w:val="22"/>
-                <w:color w:val="000000"/>
-              </w:rPr>
-            </w:pPr>
-            <w:r>
-              <w:rPr>
-                <w:rFonts w:ascii="Arial" w:hAnsi="Arial" w:eastAsia="Arial" w:cs="Arial"/>
-                <w:i w:val="false"/>
-                <w:b w:val="false"/>
-                <w:u w:val="none"/>
-                <w:strike w:val="false"/>
-                <w:sz w:val="22"/>
-                <w:szCs w:val="22"/>
-                <w:color w:val="000000"/>
-              </w:rPr>
-              <w:t xml:space="preserve">-0.02 ± 0.07, P = 0.741</w:t>
+              <w:t xml:space="preserve">0.06 ± 0.07, P = 0.384</w:t>
+            </w:r>
+          </w:p>
+        </w:tc>
+        <w:tc>
+          <w:tcPr>
+            <w:tcBorders>
+              <w:bottom w:val="none" w:sz="0" w:space="0" w:color="000000"/>
+              <w:top w:val="none" w:sz="0" w:space="0" w:color="000000"/>
+              <w:left w:val="none" w:sz="0" w:space="0" w:color="000000"/>
+              <w:right w:val="none" w:sz="0" w:space="0" w:color="000000"/>
+            </w:tcBorders>
+            <w:shd w:val="clear" w:color="auto" w:fill="FFFFFF"/>
+            <w:tcMar>
+              <w:top w:w="0" w:type="dxa"/>
+              <w:bottom w:w="0" w:type="dxa"/>
+              <w:left w:w="0" w:type="dxa"/>
+              <w:right w:w="0" w:type="dxa"/>
+            </w:tcMar>
+            <w:vAlign w:val="center"/>
+          </w:tcPr>
+          <w:p>
+            <w:pPr>
+              <w:jc w:val="left"/>
+              <w:pBdr>
+                <w:bottom w:val="none" w:sz="0" w:space="0" w:color="000000"/>
+                <w:top w:val="none" w:sz="0" w:space="0" w:color="000000"/>
+                <w:left w:val="none" w:sz="0" w:space="0" w:color="000000"/>
+                <w:right w:val="none" w:sz="0" w:space="0" w:color="000000"/>
+              </w:pBdr>
+              <w:spacing w:after="100" w:before="100" w:line="240"/>
+              <w:ind w:left="100" w:right="100" w:firstLine="0" w:firstLineChars="0"/>
+              <w:rPr>
+                <w:rFonts w:ascii="Arial" w:hAnsi="Arial" w:eastAsia="Arial" w:cs="Arial"/>
+                <w:i w:val="false"/>
+                <w:b w:val="false"/>
+                <w:u w:val="none"/>
+                <w:strike w:val="false"/>
+                <w:sz w:val="22"/>
+                <w:szCs w:val="22"/>
+                <w:color w:val="000000"/>
+              </w:rPr>
+            </w:pPr>
+            <w:r>
+              <w:rPr>
+                <w:rFonts w:ascii="Arial" w:hAnsi="Arial" w:eastAsia="Arial" w:cs="Arial"/>
+                <w:i w:val="false"/>
+                <w:b w:val="false"/>
+                <w:u w:val="none"/>
+                <w:strike w:val="false"/>
+                <w:sz w:val="22"/>
+                <w:szCs w:val="22"/>
+                <w:color w:val="000000"/>
+              </w:rPr>
+              <w:t xml:space="preserve">0.01 ± 0.07, P = 0.863</w:t>
+            </w:r>
+          </w:p>
+        </w:tc>
+        <w:tc>
+          <w:tcPr>
+            <w:tcBorders>
+              <w:bottom w:val="none" w:sz="0" w:space="0" w:color="000000"/>
+              <w:top w:val="none" w:sz="0" w:space="0" w:color="000000"/>
+              <w:left w:val="none" w:sz="0" w:space="0" w:color="000000"/>
+              <w:right w:val="none" w:sz="0" w:space="0" w:color="000000"/>
+            </w:tcBorders>
+            <w:shd w:val="clear" w:color="auto" w:fill="FFFFFF"/>
+            <w:tcMar>
+              <w:top w:w="0" w:type="dxa"/>
+              <w:bottom w:w="0" w:type="dxa"/>
+              <w:left w:w="0" w:type="dxa"/>
+              <w:right w:w="0" w:type="dxa"/>
+            </w:tcMar>
+            <w:vAlign w:val="center"/>
+          </w:tcPr>
+          <w:p>
+            <w:pPr>
+              <w:jc w:val="left"/>
+              <w:pBdr>
+                <w:bottom w:val="none" w:sz="0" w:space="0" w:color="000000"/>
+                <w:top w:val="none" w:sz="0" w:space="0" w:color="000000"/>
+                <w:left w:val="none" w:sz="0" w:space="0" w:color="000000"/>
+                <w:right w:val="none" w:sz="0" w:space="0" w:color="000000"/>
+              </w:pBdr>
+              <w:spacing w:after="100" w:before="100" w:line="240"/>
+              <w:ind w:left="100" w:right="100" w:firstLine="0" w:firstLineChars="0"/>
+              <w:rPr>
+                <w:rFonts w:ascii="Arial" w:hAnsi="Arial" w:eastAsia="Arial" w:cs="Arial"/>
+                <w:i w:val="false"/>
+                <w:b w:val="false"/>
+                <w:u w:val="none"/>
+                <w:strike w:val="false"/>
+                <w:sz w:val="22"/>
+                <w:szCs w:val="22"/>
+                <w:color w:val="000000"/>
+              </w:rPr>
+            </w:pPr>
+            <w:r>
+              <w:rPr>
+                <w:rFonts w:ascii="Arial" w:hAnsi="Arial" w:eastAsia="Arial" w:cs="Arial"/>
+                <w:i w:val="false"/>
+                <w:b w:val="false"/>
+                <w:u w:val="none"/>
+                <w:strike w:val="false"/>
+                <w:sz w:val="22"/>
+                <w:szCs w:val="22"/>
+                <w:color w:val="000000"/>
+              </w:rPr>
+              <w:t xml:space="preserve">0.11 ± 0.06, P = 0.092</w:t>
+            </w:r>
+          </w:p>
+        </w:tc>
+        <w:tc>
+          <w:tcPr>
+            <w:tcBorders>
+              <w:bottom w:val="none" w:sz="0" w:space="0" w:color="000000"/>
+              <w:top w:val="none" w:sz="0" w:space="0" w:color="000000"/>
+              <w:left w:val="none" w:sz="0" w:space="0" w:color="000000"/>
+              <w:right w:val="none" w:sz="0" w:space="0" w:color="000000"/>
+            </w:tcBorders>
+            <w:shd w:val="clear" w:color="auto" w:fill="FFFFFF"/>
+            <w:tcMar>
+              <w:top w:w="0" w:type="dxa"/>
+              <w:bottom w:w="0" w:type="dxa"/>
+              <w:left w:w="0" w:type="dxa"/>
+              <w:right w:w="0" w:type="dxa"/>
+            </w:tcMar>
+            <w:vAlign w:val="center"/>
+          </w:tcPr>
+          <w:p>
+            <w:pPr>
+              <w:jc w:val="left"/>
+              <w:pBdr>
+                <w:bottom w:val="none" w:sz="0" w:space="0" w:color="000000"/>
+                <w:top w:val="none" w:sz="0" w:space="0" w:color="000000"/>
+                <w:left w:val="none" w:sz="0" w:space="0" w:color="000000"/>
+                <w:right w:val="none" w:sz="0" w:space="0" w:color="000000"/>
+              </w:pBdr>
+              <w:spacing w:after="100" w:before="100" w:line="240"/>
+              <w:ind w:left="100" w:right="100" w:firstLine="0" w:firstLineChars="0"/>
+              <w:rPr>
+                <w:rFonts w:ascii="Arial" w:hAnsi="Arial" w:eastAsia="Arial" w:cs="Arial"/>
+                <w:i w:val="false"/>
+                <w:b w:val="false"/>
+                <w:u w:val="none"/>
+                <w:strike w:val="false"/>
+                <w:sz w:val="22"/>
+                <w:szCs w:val="22"/>
+                <w:color w:val="000000"/>
+              </w:rPr>
+            </w:pPr>
+            <w:r>
+              <w:rPr>
+                <w:rFonts w:ascii="Arial" w:hAnsi="Arial" w:eastAsia="Arial" w:cs="Arial"/>
+                <w:i w:val="false"/>
+                <w:b w:val="false"/>
+                <w:u w:val="none"/>
+                <w:strike w:val="false"/>
+                <w:sz w:val="22"/>
+                <w:szCs w:val="22"/>
+                <w:color w:val="000000"/>
+              </w:rPr>
+              <w:t xml:space="preserve">0.12 ± 0.06, P = 0.058</w:t>
+            </w:r>
+          </w:p>
+        </w:tc>
+        <w:tc>
+          <w:tcPr>
+            <w:tcBorders>
+              <w:bottom w:val="none" w:sz="0" w:space="0" w:color="000000"/>
+              <w:top w:val="none" w:sz="0" w:space="0" w:color="000000"/>
+              <w:left w:val="none" w:sz="0" w:space="0" w:color="000000"/>
+              <w:right w:val="none" w:sz="0" w:space="0" w:color="000000"/>
+            </w:tcBorders>
+            <w:shd w:val="clear" w:color="auto" w:fill="FFFFFF"/>
+            <w:tcMar>
+              <w:top w:w="0" w:type="dxa"/>
+              <w:bottom w:w="0" w:type="dxa"/>
+              <w:left w:w="0" w:type="dxa"/>
+              <w:right w:w="0" w:type="dxa"/>
+            </w:tcMar>
+            <w:vAlign w:val="center"/>
+          </w:tcPr>
+          <w:p>
+            <w:pPr>
+              <w:jc w:val="left"/>
+              <w:pBdr>
+                <w:bottom w:val="none" w:sz="0" w:space="0" w:color="000000"/>
+                <w:top w:val="none" w:sz="0" w:space="0" w:color="000000"/>
+                <w:left w:val="none" w:sz="0" w:space="0" w:color="000000"/>
+                <w:right w:val="none" w:sz="0" w:space="0" w:color="000000"/>
+              </w:pBdr>
+              <w:spacing w:after="100" w:before="100" w:line="240"/>
+              <w:ind w:left="100" w:right="100" w:firstLine="0" w:firstLineChars="0"/>
+              <w:rPr>
+                <w:rFonts w:ascii="Arial" w:hAnsi="Arial" w:eastAsia="Arial" w:cs="Arial"/>
+                <w:i w:val="false"/>
+                <w:b w:val="false"/>
+                <w:u w:val="none"/>
+                <w:strike w:val="false"/>
+                <w:sz w:val="22"/>
+                <w:szCs w:val="22"/>
+                <w:color w:val="000000"/>
+              </w:rPr>
+            </w:pPr>
+            <w:r>
+              <w:rPr>
+                <w:rFonts w:ascii="Arial" w:hAnsi="Arial" w:eastAsia="Arial" w:cs="Arial"/>
+                <w:i w:val="false"/>
+                <w:b w:val="false"/>
+                <w:u w:val="none"/>
+                <w:strike w:val="false"/>
+                <w:sz w:val="22"/>
+                <w:szCs w:val="22"/>
+                <w:color w:val="000000"/>
+              </w:rPr>
+              <w:t xml:space="preserve">-0.11 ± 0.09, P = 0.198</w:t>
+            </w:r>
+          </w:p>
+        </w:tc>
+        <w:tc>
+          <w:tcPr>
+            <w:tcBorders>
+              <w:bottom w:val="none" w:sz="0" w:space="0" w:color="000000"/>
+              <w:top w:val="none" w:sz="0" w:space="0" w:color="000000"/>
+              <w:left w:val="none" w:sz="0" w:space="0" w:color="000000"/>
+              <w:right w:val="none" w:sz="0" w:space="0" w:color="000000"/>
+            </w:tcBorders>
+            <w:shd w:val="clear" w:color="auto" w:fill="FFFFFF"/>
+            <w:tcMar>
+              <w:top w:w="0" w:type="dxa"/>
+              <w:bottom w:w="0" w:type="dxa"/>
+              <w:left w:w="0" w:type="dxa"/>
+              <w:right w:w="0" w:type="dxa"/>
+            </w:tcMar>
+            <w:vAlign w:val="center"/>
+          </w:tcPr>
+          <w:p>
+            <w:pPr>
+              <w:jc w:val="left"/>
+              <w:pBdr>
+                <w:bottom w:val="none" w:sz="0" w:space="0" w:color="000000"/>
+                <w:top w:val="none" w:sz="0" w:space="0" w:color="000000"/>
+                <w:left w:val="none" w:sz="0" w:space="0" w:color="000000"/>
+                <w:right w:val="none" w:sz="0" w:space="0" w:color="000000"/>
+              </w:pBdr>
+              <w:spacing w:after="100" w:before="100" w:line="240"/>
+              <w:ind w:left="100" w:right="100" w:firstLine="0" w:firstLineChars="0"/>
+              <w:rPr>
+                <w:rFonts w:ascii="Arial" w:hAnsi="Arial" w:eastAsia="Arial" w:cs="Arial"/>
+                <w:i w:val="false"/>
+                <w:b w:val="false"/>
+                <w:u w:val="none"/>
+                <w:strike w:val="false"/>
+                <w:sz w:val="22"/>
+                <w:szCs w:val="22"/>
+                <w:color w:val="000000"/>
+              </w:rPr>
+            </w:pPr>
+            <w:r>
+              <w:rPr>
+                <w:rFonts w:ascii="Arial" w:hAnsi="Arial" w:eastAsia="Arial" w:cs="Arial"/>
+                <w:i w:val="false"/>
+                <w:b w:val="false"/>
+                <w:u w:val="none"/>
+                <w:strike w:val="false"/>
+                <w:sz w:val="22"/>
+                <w:szCs w:val="22"/>
+                <w:color w:val="000000"/>
+              </w:rPr>
+              <w:t xml:space="preserve">-0.13 ± 0.09, P = 0.161</w:t>
             </w:r>
           </w:p>
         </w:tc>
@@ -3199,7 +3199,7 @@
                 <w:szCs w:val="22"/>
                 <w:color w:val="000000"/>
               </w:rPr>
-              <w:t xml:space="preserve">0.03 ± 0.07, P = 0.639</w:t>
+              <w:t xml:space="preserve">-0.04 ± 0.1, P = 0.714</w:t>
             </w:r>
           </w:p>
         </w:tc>
@@ -3307,7 +3307,7 @@
                 <w:szCs w:val="22"/>
                 <w:color w:val="000000"/>
               </w:rPr>
-              <w:t xml:space="preserve">-0.19 ± 0.08, P &lt; 0.05</w:t>
+              <w:t xml:space="preserve">-0.21 ± 0.09, P &lt; 0.05</w:t>
             </w:r>
           </w:p>
         </w:tc>
@@ -3415,7 +3415,7 @@
                 <w:szCs w:val="22"/>
                 <w:color w:val="000000"/>
               </w:rPr>
-              <w:t xml:space="preserve">-0.34 ± 0.14, P &lt; 0.05</w:t>
+              <w:t xml:space="preserve">-0.34 ± 0.2, P = 0.089</w:t>
             </w:r>
           </w:p>
         </w:tc>
@@ -3583,7 +3583,7 @@
                 <w:szCs w:val="22"/>
                 <w:color w:val="000000"/>
               </w:rPr>
-              <w:t xml:space="preserve">-0.28 ± 0.07, P &lt; 0.001</w:t>
+              <w:t xml:space="preserve">-0.34 ± 0.11, P &lt; 0.01</w:t>
             </w:r>
           </w:p>
         </w:tc>
@@ -3691,7 +3691,7 @@
                 <w:szCs w:val="22"/>
                 <w:color w:val="000000"/>
               </w:rPr>
-              <w:t xml:space="preserve">-0.13 ± 0.08, P = 0.094</w:t>
+              <w:t xml:space="preserve">-0.15 ± 0.1, P = 0.125</w:t>
             </w:r>
           </w:p>
         </w:tc>
@@ -3799,7 +3799,7 @@
                 <w:szCs w:val="22"/>
                 <w:color w:val="000000"/>
               </w:rPr>
-              <w:t xml:space="preserve">-0.33 ± 0.13, P &lt; 0.05</w:t>
+              <w:t xml:space="preserve">-0.23 ± 0.22, P = 0.286</w:t>
             </w:r>
           </w:p>
         </w:tc>
@@ -3967,7 +3967,7 @@
                 <w:szCs w:val="22"/>
                 <w:color w:val="000000"/>
               </w:rPr>
-              <w:t xml:space="preserve">-0.12 ± 0.04, P &lt; 0.01</w:t>
+              <w:t xml:space="preserve">-0.13 ± 0.05, P &lt; 0.05</w:t>
             </w:r>
           </w:p>
         </w:tc>
@@ -4075,7 +4075,7 @@
                 <w:szCs w:val="22"/>
                 <w:color w:val="000000"/>
               </w:rPr>
-              <w:t xml:space="preserve">0.02 ± 0.04, P = 0.698</w:t>
+              <w:t xml:space="preserve">0.04 ± 0.05, P = 0.47</w:t>
             </w:r>
           </w:p>
         </w:tc>
@@ -4183,7 +4183,7 @@
                 <w:szCs w:val="22"/>
                 <w:color w:val="000000"/>
               </w:rPr>
-              <w:t xml:space="preserve">0.09 ± 0.06, P = 0.133</w:t>
+              <w:t xml:space="preserve">0.12 ± 0.07, P = 0.071</w:t>
             </w:r>
           </w:p>
         </w:tc>
@@ -4405,7 +4405,7 @@
                 <w:szCs w:val="22"/>
                 <w:color w:val="000000"/>
               </w:rPr>
-              <w:t xml:space="preserve">0.14 ± 0.05, P &lt; 0.01</w:t>
+              <w:t xml:space="preserve">0.17 ± 0.09, P &lt; 0.05</w:t>
             </w:r>
           </w:p>
         </w:tc>
@@ -4513,7 +4513,7 @@
                 <w:szCs w:val="22"/>
                 <w:color w:val="000000"/>
               </w:rPr>
-              <w:t xml:space="preserve">0 ± 0.06, P = 0.985</w:t>
+              <w:t xml:space="preserve">-0.03 ± 0.08, P = 0.71</w:t>
             </w:r>
           </w:p>
         </w:tc>
@@ -4621,7 +4621,7 @@
                 <w:szCs w:val="22"/>
                 <w:color w:val="000000"/>
               </w:rPr>
-              <w:t xml:space="preserve">0.04 ± 0.1, P = 0.718</w:t>
+              <w:t xml:space="preserve">0.09 ± 0.16, P = 0.548</w:t>
             </w:r>
           </w:p>
         </w:tc>
@@ -4789,7 +4789,7 @@
                 <w:szCs w:val="22"/>
                 <w:color w:val="000000"/>
               </w:rPr>
-              <w:t xml:space="preserve">-0.02 ± 0.06, P = 0.791</w:t>
+              <w:t xml:space="preserve">0.05 ± 0.1, P = 0.607</w:t>
             </w:r>
           </w:p>
         </w:tc>
@@ -4897,7 +4897,7 @@
                 <w:szCs w:val="22"/>
                 <w:color w:val="000000"/>
               </w:rPr>
-              <w:t xml:space="preserve">-0.08 ± 0.07, P = 0.303</w:t>
+              <w:t xml:space="preserve">0 ± 0.09, P = 0.984</w:t>
             </w:r>
           </w:p>
         </w:tc>
@@ -5005,7 +5005,7 @@
                 <w:szCs w:val="22"/>
                 <w:color w:val="000000"/>
               </w:rPr>
-              <w:t xml:space="preserve">0.05 ± 0.12, P = 0.709</w:t>
+              <w:t xml:space="preserve">0.19 ± 0.18, P = 0.311</w:t>
             </w:r>
           </w:p>
         </w:tc>
@@ -5173,7 +5173,7 @@
                 <w:szCs w:val="22"/>
                 <w:color w:val="000000"/>
               </w:rPr>
-              <w:t xml:space="preserve">-0.1 ± 0.04, P &lt; 0.05</w:t>
+              <w:t xml:space="preserve">-0.04 ± 0.07, P = 0.533</w:t>
             </w:r>
           </w:p>
         </w:tc>
@@ -5281,7 +5281,7 @@
                 <w:szCs w:val="22"/>
                 <w:color w:val="000000"/>
               </w:rPr>
-              <w:t xml:space="preserve">-0.08 ± 0.04, P = 0.083</w:t>
+              <w:t xml:space="preserve">0 ± 0.06, P = 0.973</w:t>
             </w:r>
           </w:p>
         </w:tc>
@@ -5389,14 +5389,14 @@
                 <w:szCs w:val="22"/>
                 <w:color w:val="000000"/>
               </w:rPr>
-              <w:t xml:space="preserve">-0.03 ± 0.06, P = 0.582</w:t>
+              <w:t xml:space="preserve">0.15 ± 0.09, P = 0.091</w:t>
             </w:r>
           </w:p>
         </w:tc>
       </w:tr>
       <w:tr>
         <w:trPr>
-          <w:trHeight w:val="614" w:hRule="auto"/>
+          <w:trHeight w:val="600" w:hRule="auto"/>
         </w:trPr>
         body14
         <w:tc>
@@ -5449,7 +5449,7 @@
                 <w:szCs w:val="22"/>
                 <w:color w:val="000000"/>
               </w:rPr>
-              <w:t xml:space="preserve">Array ID</w:t>
+              <w:t xml:space="preserve">Site ID</w:t>
             </w:r>
           </w:p>
         </w:tc>
@@ -5503,7 +5503,7 @@
                 <w:szCs w:val="22"/>
                 <w:color w:val="000000"/>
               </w:rPr>
-              <w:t xml:space="preserve">0.33 ± NA, NA</w:t>
+              <w:t xml:space="preserve">1.29 ± NA, NA</w:t>
             </w:r>
           </w:p>
         </w:tc>
@@ -5557,7 +5557,7 @@
                 <w:szCs w:val="22"/>
                 <w:color w:val="000000"/>
               </w:rPr>
-              <w:t xml:space="preserve">0.29 ± NA, NA</w:t>
+              <w:t xml:space="preserve">1.28 ± NA, NA</w:t>
             </w:r>
           </w:p>
         </w:tc>
@@ -5611,7 +5611,7 @@
                 <w:szCs w:val="22"/>
                 <w:color w:val="000000"/>
               </w:rPr>
-              <w:t xml:space="preserve">0.27 ± NA, NA</w:t>
+              <w:t xml:space="preserve">0.9 ± NA, NA</w:t>
             </w:r>
           </w:p>
         </w:tc>
@@ -5665,7 +5665,7 @@
                 <w:szCs w:val="22"/>
                 <w:color w:val="000000"/>
               </w:rPr>
-              <w:t xml:space="preserve">0.35 ± NA, NA</w:t>
+              <w:t xml:space="preserve">0.92 ± NA, NA</w:t>
             </w:r>
           </w:p>
         </w:tc>
@@ -5719,7 +5719,7 @@
                 <w:szCs w:val="22"/>
                 <w:color w:val="000000"/>
               </w:rPr>
-              <w:t xml:space="preserve">1.7 ± NA, NA</w:t>
+              <w:t xml:space="preserve">1.75 ± NA, NA</w:t>
             </w:r>
           </w:p>
         </w:tc>
@@ -5773,7 +5773,7 @@
                 <w:szCs w:val="22"/>
                 <w:color w:val="000000"/>
               </w:rPr>
-              <w:t xml:space="preserve">2.2 ± NA, NA</w:t>
+              <w:t xml:space="preserve">1.79 ± NA, NA</w:t>
             </w:r>
           </w:p>
         </w:tc>

</xml_diff>